<commit_message>
atualização do space for man
</commit_message>
<xml_diff>
--- a/Apostila Space For Men.docx
+++ b/Apostila Space For Men.docx
@@ -732,7 +732,21 @@
           <w:sz w:val="24"/>
           <w:szCs w:val="24"/>
         </w:rPr>
-        <w:t>5- Inserimos um id na imagem para que ela ocupe 100% de largura da nossa página.</w:t>
+        <w:t>5</w:t>
+      </w:r>
+      <w:r>
+        <w:rPr>
+          <w:sz w:val="24"/>
+          <w:szCs w:val="24"/>
+        </w:rPr>
+        <w:t>.</w:t>
+      </w:r>
+      <w:r>
+        <w:rPr>
+          <w:sz w:val="24"/>
+          <w:szCs w:val="24"/>
+        </w:rPr>
+        <w:t xml:space="preserve"> Inserimos um id na imagem para que ela ocupe 100% de largura da nossa página.</w:t>
       </w:r>
     </w:p>
     <w:p>
@@ -884,7 +898,21 @@
           <w:sz w:val="24"/>
           <w:szCs w:val="24"/>
         </w:rPr>
-        <w:t xml:space="preserve">6- Centralizamos o </w:t>
+        <w:t>6</w:t>
+      </w:r>
+      <w:r>
+        <w:rPr>
+          <w:sz w:val="24"/>
+          <w:szCs w:val="24"/>
+        </w:rPr>
+        <w:t xml:space="preserve">. </w:t>
+      </w:r>
+      <w:r>
+        <w:rPr>
+          <w:sz w:val="24"/>
+          <w:szCs w:val="24"/>
+        </w:rPr>
+        <w:t xml:space="preserve">Centralizamos o </w:t>
       </w:r>
       <w:proofErr w:type="spellStart"/>
       <w:r>
@@ -985,7 +1013,21 @@
           <w:sz w:val="24"/>
           <w:szCs w:val="24"/>
         </w:rPr>
-        <w:t xml:space="preserve">7- No </w:t>
+        <w:t>7</w:t>
+      </w:r>
+      <w:r>
+        <w:rPr>
+          <w:sz w:val="24"/>
+          <w:szCs w:val="24"/>
+        </w:rPr>
+        <w:t xml:space="preserve">. </w:t>
+      </w:r>
+      <w:r>
+        <w:rPr>
+          <w:sz w:val="24"/>
+          <w:szCs w:val="24"/>
+        </w:rPr>
+        <w:t xml:space="preserve">No </w:t>
       </w:r>
       <w:proofErr w:type="spellStart"/>
       <w:r>
@@ -7001,6 +7043,7 @@
       </w:pPr>
       <w:r>
         <w:rPr>
+          <w:noProof/>
           <w:color w:val="000000" w:themeColor="text1"/>
           <w:sz w:val="24"/>
           <w:szCs w:val="24"/>
@@ -7136,6 +7179,7 @@
       </w:pPr>
       <w:r>
         <w:rPr>
+          <w:noProof/>
           <w:color w:val="000000" w:themeColor="text1"/>
           <w:sz w:val="24"/>
           <w:szCs w:val="24"/>
@@ -7259,6 +7303,7 @@
       </w:pPr>
       <w:r>
         <w:rPr>
+          <w:noProof/>
           <w:color w:val="000000" w:themeColor="text1"/>
           <w:sz w:val="24"/>
           <w:szCs w:val="24"/>
@@ -7315,6 +7360,7 @@
       </w:r>
       <w:r>
         <w:rPr>
+          <w:noProof/>
           <w:color w:val="000000" w:themeColor="text1"/>
           <w:sz w:val="24"/>
           <w:szCs w:val="24"/>
@@ -7545,6 +7591,7 @@
       </w:pPr>
       <w:r>
         <w:rPr>
+          <w:noProof/>
           <w:sz w:val="24"/>
           <w:szCs w:val="24"/>
         </w:rPr>
@@ -7601,6 +7648,2475 @@
           <w:szCs w:val="24"/>
         </w:rPr>
         <w:t>42.</w:t>
+      </w:r>
+      <w:r>
+        <w:rPr>
+          <w:sz w:val="24"/>
+          <w:szCs w:val="24"/>
+        </w:rPr>
+        <w:t xml:space="preserve"> Demos uma largura para o </w:t>
+      </w:r>
+      <w:proofErr w:type="spellStart"/>
+      <w:r>
+        <w:rPr>
+          <w:sz w:val="24"/>
+          <w:szCs w:val="24"/>
+        </w:rPr>
+        <w:t>main</w:t>
+      </w:r>
+      <w:proofErr w:type="spellEnd"/>
+      <w:r>
+        <w:rPr>
+          <w:sz w:val="24"/>
+          <w:szCs w:val="24"/>
+        </w:rPr>
+        <w:t xml:space="preserve"> para poder centralizar o formulário utilizando o “</w:t>
+      </w:r>
+      <w:proofErr w:type="spellStart"/>
+      <w:r>
+        <w:rPr>
+          <w:sz w:val="24"/>
+          <w:szCs w:val="24"/>
+        </w:rPr>
+        <w:t>margin</w:t>
+      </w:r>
+      <w:proofErr w:type="spellEnd"/>
+      <w:r>
+        <w:rPr>
+          <w:sz w:val="24"/>
+          <w:szCs w:val="24"/>
+        </w:rPr>
+        <w:t>: 0 auto”. No “</w:t>
+      </w:r>
+      <w:proofErr w:type="spellStart"/>
+      <w:r>
+        <w:rPr>
+          <w:sz w:val="24"/>
+          <w:szCs w:val="24"/>
+        </w:rPr>
+        <w:t>form</w:t>
+      </w:r>
+      <w:proofErr w:type="spellEnd"/>
+      <w:r>
+        <w:rPr>
+          <w:sz w:val="24"/>
+          <w:szCs w:val="24"/>
+        </w:rPr>
+        <w:t>” aumentamos o tamanho tanto para cima como também para baixo o “margin:40px 0;”</w:t>
+      </w:r>
+    </w:p>
+    <w:p>
+      <w:pPr>
+        <w:tabs>
+          <w:tab w:val="left" w:pos="6375"/>
+        </w:tabs>
+        <w:rPr>
+          <w:sz w:val="24"/>
+          <w:szCs w:val="24"/>
+        </w:rPr>
+      </w:pPr>
+      <w:r>
+        <w:rPr>
+          <w:noProof/>
+          <w:sz w:val="24"/>
+          <w:szCs w:val="24"/>
+        </w:rPr>
+        <w:drawing>
+          <wp:inline distT="0" distB="0" distL="0" distR="0" wp14:anchorId="41FE9056" wp14:editId="758E1A51">
+            <wp:extent cx="1790950" cy="1324160"/>
+            <wp:effectExtent l="0" t="0" r="0" b="9525"/>
+            <wp:docPr id="64" name="Imagem 64"/>
+            <wp:cNvGraphicFramePr>
+              <a:graphicFrameLocks xmlns:a="http://schemas.openxmlformats.org/drawingml/2006/main" noChangeAspect="1"/>
+            </wp:cNvGraphicFramePr>
+            <a:graphic xmlns:a="http://schemas.openxmlformats.org/drawingml/2006/main">
+              <a:graphicData uri="http://schemas.openxmlformats.org/drawingml/2006/picture">
+                <pic:pic xmlns:pic="http://schemas.openxmlformats.org/drawingml/2006/picture">
+                  <pic:nvPicPr>
+                    <pic:cNvPr id="1" name=""/>
+                    <pic:cNvPicPr/>
+                  </pic:nvPicPr>
+                  <pic:blipFill>
+                    <a:blip r:embed="rId70"/>
+                    <a:stretch>
+                      <a:fillRect/>
+                    </a:stretch>
+                  </pic:blipFill>
+                  <pic:spPr>
+                    <a:xfrm>
+                      <a:off x="0" y="0"/>
+                      <a:ext cx="1790950" cy="1324160"/>
+                    </a:xfrm>
+                    <a:prstGeom prst="rect">
+                      <a:avLst/>
+                    </a:prstGeom>
+                  </pic:spPr>
+                </pic:pic>
+              </a:graphicData>
+            </a:graphic>
+          </wp:inline>
+        </w:drawing>
+      </w:r>
+    </w:p>
+    <w:p>
+      <w:pPr>
+        <w:tabs>
+          <w:tab w:val="left" w:pos="6375"/>
+        </w:tabs>
+        <w:rPr>
+          <w:sz w:val="24"/>
+          <w:szCs w:val="24"/>
+        </w:rPr>
+      </w:pPr>
+      <w:r>
+        <w:rPr>
+          <w:sz w:val="24"/>
+          <w:szCs w:val="24"/>
+        </w:rPr>
+        <w:t>43.</w:t>
+      </w:r>
+      <w:r>
+        <w:rPr>
+          <w:sz w:val="24"/>
+          <w:szCs w:val="24"/>
+        </w:rPr>
+        <w:t xml:space="preserve"> Trabalhamos com a natureza da </w:t>
+      </w:r>
+      <w:proofErr w:type="spellStart"/>
+      <w:r>
+        <w:rPr>
+          <w:sz w:val="24"/>
+          <w:szCs w:val="24"/>
+        </w:rPr>
+        <w:t>label</w:t>
+      </w:r>
+      <w:proofErr w:type="spellEnd"/>
+      <w:r>
+        <w:rPr>
+          <w:sz w:val="24"/>
+          <w:szCs w:val="24"/>
+        </w:rPr>
+        <w:t xml:space="preserve"> e </w:t>
+      </w:r>
+      <w:proofErr w:type="gramStart"/>
+      <w:r>
+        <w:rPr>
+          <w:sz w:val="24"/>
+          <w:szCs w:val="24"/>
+        </w:rPr>
+        <w:t>do inputs</w:t>
+      </w:r>
+      <w:proofErr w:type="gramEnd"/>
+      <w:r>
+        <w:rPr>
+          <w:sz w:val="24"/>
+          <w:szCs w:val="24"/>
+        </w:rPr>
+        <w:t xml:space="preserve">, mudamos para o </w:t>
+      </w:r>
+      <w:proofErr w:type="spellStart"/>
+      <w:r>
+        <w:rPr>
+          <w:sz w:val="24"/>
+          <w:szCs w:val="24"/>
+        </w:rPr>
+        <w:t>block</w:t>
+      </w:r>
+      <w:proofErr w:type="spellEnd"/>
+      <w:r>
+        <w:rPr>
+          <w:sz w:val="24"/>
+          <w:szCs w:val="24"/>
+        </w:rPr>
+        <w:t xml:space="preserve"> assim tanto o </w:t>
+      </w:r>
+      <w:proofErr w:type="spellStart"/>
+      <w:r>
+        <w:rPr>
+          <w:sz w:val="24"/>
+          <w:szCs w:val="24"/>
+        </w:rPr>
+        <w:t>label</w:t>
+      </w:r>
+      <w:proofErr w:type="spellEnd"/>
+      <w:r>
+        <w:rPr>
+          <w:sz w:val="24"/>
+          <w:szCs w:val="24"/>
+        </w:rPr>
+        <w:t xml:space="preserve"> como o inputs </w:t>
+      </w:r>
+      <w:r>
+        <w:rPr>
+          <w:sz w:val="24"/>
+          <w:szCs w:val="24"/>
+        </w:rPr>
+        <w:t xml:space="preserve">fica acima do outro e demos um espaço entre eles utilizando o </w:t>
+      </w:r>
+      <w:proofErr w:type="spellStart"/>
+      <w:r>
+        <w:rPr>
+          <w:sz w:val="24"/>
+          <w:szCs w:val="24"/>
+        </w:rPr>
+        <w:t>margin</w:t>
+      </w:r>
+      <w:proofErr w:type="spellEnd"/>
+      <w:r>
+        <w:rPr>
+          <w:sz w:val="24"/>
+          <w:szCs w:val="24"/>
+        </w:rPr>
+        <w:t xml:space="preserve"> (espaço externo).</w:t>
+      </w:r>
+    </w:p>
+    <w:p>
+      <w:pPr>
+        <w:tabs>
+          <w:tab w:val="left" w:pos="6375"/>
+        </w:tabs>
+        <w:rPr>
+          <w:sz w:val="24"/>
+          <w:szCs w:val="24"/>
+        </w:rPr>
+      </w:pPr>
+      <w:r>
+        <w:rPr>
+          <w:noProof/>
+          <w:sz w:val="24"/>
+          <w:szCs w:val="24"/>
+        </w:rPr>
+        <w:drawing>
+          <wp:inline distT="0" distB="0" distL="0" distR="0" wp14:anchorId="2C77663A" wp14:editId="2DBDA5B4">
+            <wp:extent cx="1958912" cy="1811211"/>
+            <wp:effectExtent l="0" t="0" r="3810" b="0"/>
+            <wp:docPr id="67" name="Imagem 67"/>
+            <wp:cNvGraphicFramePr>
+              <a:graphicFrameLocks xmlns:a="http://schemas.openxmlformats.org/drawingml/2006/main" noChangeAspect="1"/>
+            </wp:cNvGraphicFramePr>
+            <a:graphic xmlns:a="http://schemas.openxmlformats.org/drawingml/2006/main">
+              <a:graphicData uri="http://schemas.openxmlformats.org/drawingml/2006/picture">
+                <pic:pic xmlns:pic="http://schemas.openxmlformats.org/drawingml/2006/picture">
+                  <pic:nvPicPr>
+                    <pic:cNvPr id="1" name=""/>
+                    <pic:cNvPicPr/>
+                  </pic:nvPicPr>
+                  <pic:blipFill>
+                    <a:blip r:embed="rId71"/>
+                    <a:stretch>
+                      <a:fillRect/>
+                    </a:stretch>
+                  </pic:blipFill>
+                  <pic:spPr>
+                    <a:xfrm>
+                      <a:off x="0" y="0"/>
+                      <a:ext cx="2095517" cy="1937516"/>
+                    </a:xfrm>
+                    <a:prstGeom prst="rect">
+                      <a:avLst/>
+                    </a:prstGeom>
+                  </pic:spPr>
+                </pic:pic>
+              </a:graphicData>
+            </a:graphic>
+          </wp:inline>
+        </w:drawing>
+      </w:r>
+      <w:r>
+        <w:rPr>
+          <w:noProof/>
+          <w:sz w:val="24"/>
+          <w:szCs w:val="24"/>
+        </w:rPr>
+        <w:drawing>
+          <wp:inline distT="0" distB="0" distL="0" distR="0" wp14:anchorId="2922C1D7" wp14:editId="1EE56B33">
+            <wp:extent cx="3009186" cy="1811475"/>
+            <wp:effectExtent l="0" t="0" r="1270" b="0"/>
+            <wp:docPr id="70" name="Imagem 70"/>
+            <wp:cNvGraphicFramePr>
+              <a:graphicFrameLocks xmlns:a="http://schemas.openxmlformats.org/drawingml/2006/main" noChangeAspect="1"/>
+            </wp:cNvGraphicFramePr>
+            <a:graphic xmlns:a="http://schemas.openxmlformats.org/drawingml/2006/main">
+              <a:graphicData uri="http://schemas.openxmlformats.org/drawingml/2006/picture">
+                <pic:pic xmlns:pic="http://schemas.openxmlformats.org/drawingml/2006/picture">
+                  <pic:nvPicPr>
+                    <pic:cNvPr id="1" name=""/>
+                    <pic:cNvPicPr/>
+                  </pic:nvPicPr>
+                  <pic:blipFill>
+                    <a:blip r:embed="rId72"/>
+                    <a:stretch>
+                      <a:fillRect/>
+                    </a:stretch>
+                  </pic:blipFill>
+                  <pic:spPr>
+                    <a:xfrm>
+                      <a:off x="0" y="0"/>
+                      <a:ext cx="3078519" cy="1853212"/>
+                    </a:xfrm>
+                    <a:prstGeom prst="rect">
+                      <a:avLst/>
+                    </a:prstGeom>
+                  </pic:spPr>
+                </pic:pic>
+              </a:graphicData>
+            </a:graphic>
+          </wp:inline>
+        </w:drawing>
+      </w:r>
+    </w:p>
+    <w:p>
+      <w:pPr>
+        <w:tabs>
+          <w:tab w:val="left" w:pos="6375"/>
+        </w:tabs>
+        <w:rPr>
+          <w:noProof/>
+        </w:rPr>
+      </w:pPr>
+      <w:r>
+        <w:rPr>
+          <w:noProof/>
+          <w:sz w:val="24"/>
+          <w:szCs w:val="24"/>
+        </w:rPr>
+        <w:lastRenderedPageBreak/>
+        <mc:AlternateContent>
+          <mc:Choice Requires="wps">
+            <w:drawing>
+              <wp:anchor distT="0" distB="0" distL="114300" distR="114300" simplePos="0" relativeHeight="251695104" behindDoc="0" locked="0" layoutInCell="1" allowOverlap="1">
+                <wp:simplePos x="0" y="0"/>
+                <wp:positionH relativeFrom="column">
+                  <wp:posOffset>1576801</wp:posOffset>
+                </wp:positionH>
+                <wp:positionV relativeFrom="paragraph">
+                  <wp:posOffset>1308567</wp:posOffset>
+                </wp:positionV>
+                <wp:extent cx="569343" cy="327840"/>
+                <wp:effectExtent l="38100" t="0" r="21590" b="53340"/>
+                <wp:wrapNone/>
+                <wp:docPr id="83" name="Conector de Seta Reta 83"/>
+                <wp:cNvGraphicFramePr/>
+                <a:graphic xmlns:a="http://schemas.openxmlformats.org/drawingml/2006/main">
+                  <a:graphicData uri="http://schemas.microsoft.com/office/word/2010/wordprocessingShape">
+                    <wps:wsp>
+                      <wps:cNvCnPr/>
+                      <wps:spPr>
+                        <a:xfrm flipH="1">
+                          <a:off x="0" y="0"/>
+                          <a:ext cx="569343" cy="327840"/>
+                        </a:xfrm>
+                        <a:prstGeom prst="straightConnector1">
+                          <a:avLst/>
+                        </a:prstGeom>
+                        <a:ln>
+                          <a:tailEnd type="triangle"/>
+                        </a:ln>
+                      </wps:spPr>
+                      <wps:style>
+                        <a:lnRef idx="1">
+                          <a:schemeClr val="accent1"/>
+                        </a:lnRef>
+                        <a:fillRef idx="0">
+                          <a:schemeClr val="accent1"/>
+                        </a:fillRef>
+                        <a:effectRef idx="0">
+                          <a:schemeClr val="accent1"/>
+                        </a:effectRef>
+                        <a:fontRef idx="minor">
+                          <a:schemeClr val="tx1"/>
+                        </a:fontRef>
+                      </wps:style>
+                      <wps:bodyPr/>
+                    </wps:wsp>
+                  </a:graphicData>
+                </a:graphic>
+                <wp14:sizeRelH relativeFrom="margin">
+                  <wp14:pctWidth>0</wp14:pctWidth>
+                </wp14:sizeRelH>
+                <wp14:sizeRelV relativeFrom="margin">
+                  <wp14:pctHeight>0</wp14:pctHeight>
+                </wp14:sizeRelV>
+              </wp:anchor>
+            </w:drawing>
+          </mc:Choice>
+          <mc:Fallback>
+            <w:pict>
+              <v:shapetype w14:anchorId="593EA0CE" id="_x0000_t32" coordsize="21600,21600" o:spt="32" o:oned="t" path="m,l21600,21600e" filled="f">
+                <v:path arrowok="t" fillok="f" o:connecttype="none"/>
+                <o:lock v:ext="edit" shapetype="t"/>
+              </v:shapetype>
+              <v:shape id="Conector de Seta Reta 83" o:spid="_x0000_s1026" type="#_x0000_t32" style="position:absolute;margin-left:124.15pt;margin-top:103.05pt;width:44.85pt;height:25.8pt;flip:x;z-index:251695104;visibility:visible;mso-wrap-style:square;mso-width-percent:0;mso-height-percent:0;mso-wrap-distance-left:9pt;mso-wrap-distance-top:0;mso-wrap-distance-right:9pt;mso-wrap-distance-bottom:0;mso-position-horizontal:absolute;mso-position-horizontal-relative:text;mso-position-vertical:absolute;mso-position-vertical-relative:text;mso-width-percent:0;mso-height-percent:0;mso-width-relative:margin;mso-height-relative:margin" o:gfxdata="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" strokecolor="#4472c4 [3204]" strokeweight=".5pt">
+                <v:stroke endarrow="block" joinstyle="miter"/>
+              </v:shape>
+            </w:pict>
+          </mc:Fallback>
+        </mc:AlternateContent>
+      </w:r>
+      <w:r>
+        <w:rPr>
+          <w:noProof/>
+          <w:sz w:val="24"/>
+          <w:szCs w:val="24"/>
+        </w:rPr>
+        <mc:AlternateContent>
+          <mc:Choice Requires="wps">
+            <w:drawing>
+              <wp:anchor distT="0" distB="0" distL="114300" distR="114300" simplePos="0" relativeHeight="251694080" behindDoc="0" locked="0" layoutInCell="1" allowOverlap="1">
+                <wp:simplePos x="0" y="0"/>
+                <wp:positionH relativeFrom="column">
+                  <wp:posOffset>1585367</wp:posOffset>
+                </wp:positionH>
+                <wp:positionV relativeFrom="paragraph">
+                  <wp:posOffset>669817</wp:posOffset>
+                </wp:positionV>
+                <wp:extent cx="629129" cy="344889"/>
+                <wp:effectExtent l="38100" t="0" r="19050" b="55245"/>
+                <wp:wrapNone/>
+                <wp:docPr id="78" name="Conector de Seta Reta 78"/>
+                <wp:cNvGraphicFramePr/>
+                <a:graphic xmlns:a="http://schemas.openxmlformats.org/drawingml/2006/main">
+                  <a:graphicData uri="http://schemas.microsoft.com/office/word/2010/wordprocessingShape">
+                    <wps:wsp>
+                      <wps:cNvCnPr/>
+                      <wps:spPr>
+                        <a:xfrm flipH="1">
+                          <a:off x="0" y="0"/>
+                          <a:ext cx="629129" cy="344889"/>
+                        </a:xfrm>
+                        <a:prstGeom prst="straightConnector1">
+                          <a:avLst/>
+                        </a:prstGeom>
+                        <a:ln>
+                          <a:tailEnd type="triangle"/>
+                        </a:ln>
+                      </wps:spPr>
+                      <wps:style>
+                        <a:lnRef idx="1">
+                          <a:schemeClr val="accent1"/>
+                        </a:lnRef>
+                        <a:fillRef idx="0">
+                          <a:schemeClr val="accent1"/>
+                        </a:fillRef>
+                        <a:effectRef idx="0">
+                          <a:schemeClr val="accent1"/>
+                        </a:effectRef>
+                        <a:fontRef idx="minor">
+                          <a:schemeClr val="tx1"/>
+                        </a:fontRef>
+                      </wps:style>
+                      <wps:bodyPr/>
+                    </wps:wsp>
+                  </a:graphicData>
+                </a:graphic>
+                <wp14:sizeRelH relativeFrom="margin">
+                  <wp14:pctWidth>0</wp14:pctWidth>
+                </wp14:sizeRelH>
+                <wp14:sizeRelV relativeFrom="margin">
+                  <wp14:pctHeight>0</wp14:pctHeight>
+                </wp14:sizeRelV>
+              </wp:anchor>
+            </w:drawing>
+          </mc:Choice>
+          <mc:Fallback>
+            <w:pict>
+              <v:shape w14:anchorId="67D00A81" id="Conector de Seta Reta 78" o:spid="_x0000_s1026" type="#_x0000_t32" style="position:absolute;margin-left:124.85pt;margin-top:52.75pt;width:49.55pt;height:27.15pt;flip:x;z-index:251694080;visibility:visible;mso-wrap-style:square;mso-width-percent:0;mso-height-percent:0;mso-wrap-distance-left:9pt;mso-wrap-distance-top:0;mso-wrap-distance-right:9pt;mso-wrap-distance-bottom:0;mso-position-horizontal:absolute;mso-position-horizontal-relative:text;mso-position-vertical:absolute;mso-position-vertical-relative:text;mso-width-percent:0;mso-height-percent:0;mso-width-relative:margin;mso-height-relative:margin" o:gfxdata="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" strokecolor="#4472c4 [3204]" strokeweight=".5pt">
+                <v:stroke endarrow="block" joinstyle="miter"/>
+              </v:shape>
+            </w:pict>
+          </mc:Fallback>
+        </mc:AlternateContent>
+      </w:r>
+      <w:r>
+        <w:rPr>
+          <w:sz w:val="24"/>
+          <w:szCs w:val="24"/>
+        </w:rPr>
+        <w:t>44.</w:t>
+      </w:r>
+      <w:r>
+        <w:rPr>
+          <w:sz w:val="24"/>
+          <w:szCs w:val="24"/>
+        </w:rPr>
+        <w:t xml:space="preserve"> Aumentamos o tamanho da </w:t>
+      </w:r>
+      <w:proofErr w:type="spellStart"/>
+      <w:r>
+        <w:rPr>
+          <w:sz w:val="24"/>
+          <w:szCs w:val="24"/>
+        </w:rPr>
+        <w:t>label</w:t>
+      </w:r>
+      <w:proofErr w:type="spellEnd"/>
+      <w:r>
+        <w:rPr>
+          <w:sz w:val="24"/>
+          <w:szCs w:val="24"/>
+        </w:rPr>
+        <w:t xml:space="preserve"> e também o espaço interno dos inputs, para conseguir uma largura de 50% para ocupar a metade do espaço.</w:t>
+      </w:r>
+      <w:r>
+        <w:rPr>
+          <w:noProof/>
+        </w:rPr>
+        <w:t xml:space="preserve"> </w:t>
+      </w:r>
+      <w:r>
+        <w:rPr>
+          <w:noProof/>
+          <w:sz w:val="24"/>
+          <w:szCs w:val="24"/>
+        </w:rPr>
+        <w:drawing>
+          <wp:inline distT="0" distB="0" distL="0" distR="0" wp14:anchorId="409B8FCF" wp14:editId="0287D2EE">
+            <wp:extent cx="1991003" cy="2152950"/>
+            <wp:effectExtent l="0" t="0" r="9525" b="0"/>
+            <wp:docPr id="71" name="Imagem 71"/>
+            <wp:cNvGraphicFramePr>
+              <a:graphicFrameLocks xmlns:a="http://schemas.openxmlformats.org/drawingml/2006/main" noChangeAspect="1"/>
+            </wp:cNvGraphicFramePr>
+            <a:graphic xmlns:a="http://schemas.openxmlformats.org/drawingml/2006/main">
+              <a:graphicData uri="http://schemas.openxmlformats.org/drawingml/2006/picture">
+                <pic:pic xmlns:pic="http://schemas.openxmlformats.org/drawingml/2006/picture">
+                  <pic:nvPicPr>
+                    <pic:cNvPr id="1" name=""/>
+                    <pic:cNvPicPr/>
+                  </pic:nvPicPr>
+                  <pic:blipFill>
+                    <a:blip r:embed="rId73"/>
+                    <a:stretch>
+                      <a:fillRect/>
+                    </a:stretch>
+                  </pic:blipFill>
+                  <pic:spPr>
+                    <a:xfrm>
+                      <a:off x="0" y="0"/>
+                      <a:ext cx="1991003" cy="2152950"/>
+                    </a:xfrm>
+                    <a:prstGeom prst="rect">
+                      <a:avLst/>
+                    </a:prstGeom>
+                  </pic:spPr>
+                </pic:pic>
+              </a:graphicData>
+            </a:graphic>
+          </wp:inline>
+        </w:drawing>
+      </w:r>
+    </w:p>
+    <w:p>
+      <w:pPr>
+        <w:tabs>
+          <w:tab w:val="left" w:pos="6375"/>
+        </w:tabs>
+        <w:rPr>
+          <w:sz w:val="24"/>
+          <w:szCs w:val="24"/>
+        </w:rPr>
+      </w:pPr>
+      <w:r>
+        <w:rPr>
+          <w:sz w:val="24"/>
+          <w:szCs w:val="24"/>
+        </w:rPr>
+        <w:t>45.</w:t>
+      </w:r>
+      <w:r>
+        <w:rPr>
+          <w:sz w:val="24"/>
+          <w:szCs w:val="24"/>
+        </w:rPr>
+        <w:t xml:space="preserve"> </w:t>
+      </w:r>
+      <w:r>
+        <w:rPr>
+          <w:sz w:val="24"/>
+          <w:szCs w:val="24"/>
+        </w:rPr>
+        <w:t xml:space="preserve">Adicionamos o </w:t>
+      </w:r>
+      <w:proofErr w:type="spellStart"/>
+      <w:r>
+        <w:rPr>
+          <w:sz w:val="24"/>
+          <w:szCs w:val="24"/>
+        </w:rPr>
+        <w:t>textarea</w:t>
+      </w:r>
+      <w:proofErr w:type="spellEnd"/>
+      <w:r>
+        <w:rPr>
+          <w:sz w:val="24"/>
+          <w:szCs w:val="24"/>
+        </w:rPr>
+        <w:t xml:space="preserve"> </w:t>
+      </w:r>
+      <w:proofErr w:type="gramStart"/>
+      <w:r>
+        <w:rPr>
+          <w:sz w:val="24"/>
+          <w:szCs w:val="24"/>
+        </w:rPr>
+        <w:t>ao inputs</w:t>
+      </w:r>
+      <w:proofErr w:type="gramEnd"/>
+      <w:r>
+        <w:rPr>
+          <w:sz w:val="24"/>
+          <w:szCs w:val="24"/>
+        </w:rPr>
+        <w:t xml:space="preserve"> que utilizamos para enviar a mensagem mais longa do texto.</w:t>
+      </w:r>
+    </w:p>
+    <w:p>
+      <w:pPr>
+        <w:tabs>
+          <w:tab w:val="left" w:pos="6375"/>
+        </w:tabs>
+        <w:rPr>
+          <w:sz w:val="24"/>
+          <w:szCs w:val="24"/>
+        </w:rPr>
+      </w:pPr>
+      <w:r>
+        <w:rPr>
+          <w:noProof/>
+          <w:sz w:val="24"/>
+          <w:szCs w:val="24"/>
+        </w:rPr>
+        <w:drawing>
+          <wp:inline distT="0" distB="0" distL="0" distR="0" wp14:anchorId="29892736" wp14:editId="21A01172">
+            <wp:extent cx="5400040" cy="359410"/>
+            <wp:effectExtent l="0" t="0" r="0" b="2540"/>
+            <wp:docPr id="84" name="Imagem 84"/>
+            <wp:cNvGraphicFramePr>
+              <a:graphicFrameLocks xmlns:a="http://schemas.openxmlformats.org/drawingml/2006/main" noChangeAspect="1"/>
+            </wp:cNvGraphicFramePr>
+            <a:graphic xmlns:a="http://schemas.openxmlformats.org/drawingml/2006/main">
+              <a:graphicData uri="http://schemas.openxmlformats.org/drawingml/2006/picture">
+                <pic:pic xmlns:pic="http://schemas.openxmlformats.org/drawingml/2006/picture">
+                  <pic:nvPicPr>
+                    <pic:cNvPr id="1" name=""/>
+                    <pic:cNvPicPr/>
+                  </pic:nvPicPr>
+                  <pic:blipFill>
+                    <a:blip r:embed="rId74"/>
+                    <a:stretch>
+                      <a:fillRect/>
+                    </a:stretch>
+                  </pic:blipFill>
+                  <pic:spPr>
+                    <a:xfrm>
+                      <a:off x="0" y="0"/>
+                      <a:ext cx="5400040" cy="359410"/>
+                    </a:xfrm>
+                    <a:prstGeom prst="rect">
+                      <a:avLst/>
+                    </a:prstGeom>
+                  </pic:spPr>
+                </pic:pic>
+              </a:graphicData>
+            </a:graphic>
+          </wp:inline>
+        </w:drawing>
+      </w:r>
+    </w:p>
+    <w:p>
+      <w:pPr>
+        <w:tabs>
+          <w:tab w:val="left" w:pos="6375"/>
+        </w:tabs>
+        <w:rPr>
+          <w:sz w:val="24"/>
+          <w:szCs w:val="24"/>
+        </w:rPr>
+      </w:pPr>
+      <w:r>
+        <w:rPr>
+          <w:noProof/>
+          <w:sz w:val="24"/>
+          <w:szCs w:val="24"/>
+        </w:rPr>
+        <w:drawing>
+          <wp:inline distT="0" distB="0" distL="0" distR="0" wp14:anchorId="728CB88E" wp14:editId="2605222B">
+            <wp:extent cx="5106113" cy="2267266"/>
+            <wp:effectExtent l="0" t="0" r="0" b="0"/>
+            <wp:docPr id="85" name="Imagem 85"/>
+            <wp:cNvGraphicFramePr>
+              <a:graphicFrameLocks xmlns:a="http://schemas.openxmlformats.org/drawingml/2006/main" noChangeAspect="1"/>
+            </wp:cNvGraphicFramePr>
+            <a:graphic xmlns:a="http://schemas.openxmlformats.org/drawingml/2006/main">
+              <a:graphicData uri="http://schemas.openxmlformats.org/drawingml/2006/picture">
+                <pic:pic xmlns:pic="http://schemas.openxmlformats.org/drawingml/2006/picture">
+                  <pic:nvPicPr>
+                    <pic:cNvPr id="1" name=""/>
+                    <pic:cNvPicPr/>
+                  </pic:nvPicPr>
+                  <pic:blipFill>
+                    <a:blip r:embed="rId75"/>
+                    <a:stretch>
+                      <a:fillRect/>
+                    </a:stretch>
+                  </pic:blipFill>
+                  <pic:spPr>
+                    <a:xfrm>
+                      <a:off x="0" y="0"/>
+                      <a:ext cx="5106113" cy="2267266"/>
+                    </a:xfrm>
+                    <a:prstGeom prst="rect">
+                      <a:avLst/>
+                    </a:prstGeom>
+                  </pic:spPr>
+                </pic:pic>
+              </a:graphicData>
+            </a:graphic>
+          </wp:inline>
+        </w:drawing>
+      </w:r>
+    </w:p>
+    <w:p>
+      <w:pPr>
+        <w:tabs>
+          <w:tab w:val="left" w:pos="6375"/>
+        </w:tabs>
+        <w:rPr>
+          <w:sz w:val="24"/>
+          <w:szCs w:val="24"/>
+        </w:rPr>
+      </w:pPr>
+      <w:r>
+        <w:rPr>
+          <w:sz w:val="24"/>
+          <w:szCs w:val="24"/>
+        </w:rPr>
+        <w:t>46.</w:t>
+      </w:r>
+      <w:r>
+        <w:rPr>
+          <w:sz w:val="24"/>
+          <w:szCs w:val="24"/>
+        </w:rPr>
+        <w:t xml:space="preserve"> Adicionamos as </w:t>
+      </w:r>
+      <w:proofErr w:type="spellStart"/>
+      <w:r>
+        <w:rPr>
+          <w:sz w:val="24"/>
+          <w:szCs w:val="24"/>
+        </w:rPr>
+        <w:t>label</w:t>
+      </w:r>
+      <w:proofErr w:type="spellEnd"/>
+      <w:r>
+        <w:rPr>
+          <w:sz w:val="24"/>
+          <w:szCs w:val="24"/>
+        </w:rPr>
+        <w:t xml:space="preserve"> e os inputs </w:t>
+      </w:r>
+      <w:proofErr w:type="spellStart"/>
+      <w:r>
+        <w:rPr>
+          <w:sz w:val="24"/>
+          <w:szCs w:val="24"/>
+        </w:rPr>
+        <w:t>radio</w:t>
+      </w:r>
+      <w:proofErr w:type="spellEnd"/>
+      <w:r>
+        <w:rPr>
+          <w:sz w:val="24"/>
+          <w:szCs w:val="24"/>
+        </w:rPr>
+        <w:t>.</w:t>
+      </w:r>
+    </w:p>
+    <w:p>
+      <w:pPr>
+        <w:tabs>
+          <w:tab w:val="left" w:pos="6375"/>
+        </w:tabs>
+        <w:rPr>
+          <w:sz w:val="24"/>
+          <w:szCs w:val="24"/>
+        </w:rPr>
+      </w:pPr>
+      <w:r>
+        <w:rPr>
+          <w:noProof/>
+          <w:sz w:val="24"/>
+          <w:szCs w:val="24"/>
+        </w:rPr>
+        <w:drawing>
+          <wp:anchor distT="0" distB="0" distL="114300" distR="114300" simplePos="0" relativeHeight="251696128" behindDoc="0" locked="0" layoutInCell="1" allowOverlap="1" wp14:anchorId="1DEDCB95">
+            <wp:simplePos x="0" y="0"/>
+            <wp:positionH relativeFrom="margin">
+              <wp:align>left</wp:align>
+            </wp:positionH>
+            <wp:positionV relativeFrom="paragraph">
+              <wp:posOffset>1510089</wp:posOffset>
+            </wp:positionV>
+            <wp:extent cx="4191000" cy="1247931"/>
+            <wp:effectExtent l="0" t="0" r="0" b="9525"/>
+            <wp:wrapNone/>
+            <wp:docPr id="87" name="Imagem 87"/>
+            <wp:cNvGraphicFramePr>
+              <a:graphicFrameLocks xmlns:a="http://schemas.openxmlformats.org/drawingml/2006/main" noChangeAspect="1"/>
+            </wp:cNvGraphicFramePr>
+            <a:graphic xmlns:a="http://schemas.openxmlformats.org/drawingml/2006/main">
+              <a:graphicData uri="http://schemas.openxmlformats.org/drawingml/2006/picture">
+                <pic:pic xmlns:pic="http://schemas.openxmlformats.org/drawingml/2006/picture">
+                  <pic:nvPicPr>
+                    <pic:cNvPr id="1" name=""/>
+                    <pic:cNvPicPr/>
+                  </pic:nvPicPr>
+                  <pic:blipFill>
+                    <a:blip r:embed="rId76">
+                      <a:extLst>
+                        <a:ext uri="{28A0092B-C50C-407E-A947-70E740481C1C}">
+                          <a14:useLocalDpi xmlns:a14="http://schemas.microsoft.com/office/drawing/2010/main" val="0"/>
+                        </a:ext>
+                      </a:extLst>
+                    </a:blip>
+                    <a:stretch>
+                      <a:fillRect/>
+                    </a:stretch>
+                  </pic:blipFill>
+                  <pic:spPr>
+                    <a:xfrm>
+                      <a:off x="0" y="0"/>
+                      <a:ext cx="4191000" cy="1247931"/>
+                    </a:xfrm>
+                    <a:prstGeom prst="rect">
+                      <a:avLst/>
+                    </a:prstGeom>
+                  </pic:spPr>
+                </pic:pic>
+              </a:graphicData>
+            </a:graphic>
+            <wp14:sizeRelH relativeFrom="margin">
+              <wp14:pctWidth>0</wp14:pctWidth>
+            </wp14:sizeRelH>
+            <wp14:sizeRelV relativeFrom="margin">
+              <wp14:pctHeight>0</wp14:pctHeight>
+            </wp14:sizeRelV>
+          </wp:anchor>
+        </w:drawing>
+      </w:r>
+      <w:r>
+        <w:rPr>
+          <w:noProof/>
+          <w:sz w:val="24"/>
+          <w:szCs w:val="24"/>
+        </w:rPr>
+        <w:drawing>
+          <wp:inline distT="0" distB="0" distL="0" distR="0" wp14:anchorId="00E4E60D" wp14:editId="6674C700">
+            <wp:extent cx="4191585" cy="1486107"/>
+            <wp:effectExtent l="0" t="0" r="0" b="0"/>
+            <wp:docPr id="86" name="Imagem 86"/>
+            <wp:cNvGraphicFramePr>
+              <a:graphicFrameLocks xmlns:a="http://schemas.openxmlformats.org/drawingml/2006/main" noChangeAspect="1"/>
+            </wp:cNvGraphicFramePr>
+            <a:graphic xmlns:a="http://schemas.openxmlformats.org/drawingml/2006/main">
+              <a:graphicData uri="http://schemas.openxmlformats.org/drawingml/2006/picture">
+                <pic:pic xmlns:pic="http://schemas.openxmlformats.org/drawingml/2006/picture">
+                  <pic:nvPicPr>
+                    <pic:cNvPr id="1" name=""/>
+                    <pic:cNvPicPr/>
+                  </pic:nvPicPr>
+                  <pic:blipFill>
+                    <a:blip r:embed="rId77"/>
+                    <a:stretch>
+                      <a:fillRect/>
+                    </a:stretch>
+                  </pic:blipFill>
+                  <pic:spPr>
+                    <a:xfrm>
+                      <a:off x="0" y="0"/>
+                      <a:ext cx="4191585" cy="1486107"/>
+                    </a:xfrm>
+                    <a:prstGeom prst="rect">
+                      <a:avLst/>
+                    </a:prstGeom>
+                  </pic:spPr>
+                </pic:pic>
+              </a:graphicData>
+            </a:graphic>
+          </wp:inline>
+        </w:drawing>
+      </w:r>
+    </w:p>
+    <w:p>
+      <w:pPr>
+        <w:tabs>
+          <w:tab w:val="left" w:pos="6375"/>
+        </w:tabs>
+        <w:rPr>
+          <w:sz w:val="24"/>
+          <w:szCs w:val="24"/>
+        </w:rPr>
+      </w:pPr>
+    </w:p>
+    <w:p>
+      <w:pPr>
+        <w:tabs>
+          <w:tab w:val="left" w:pos="6375"/>
+        </w:tabs>
+        <w:rPr>
+          <w:sz w:val="24"/>
+          <w:szCs w:val="24"/>
+        </w:rPr>
+      </w:pPr>
+    </w:p>
+    <w:p>
+      <w:pPr>
+        <w:tabs>
+          <w:tab w:val="left" w:pos="6375"/>
+        </w:tabs>
+        <w:rPr>
+          <w:sz w:val="24"/>
+          <w:szCs w:val="24"/>
+        </w:rPr>
+      </w:pPr>
+    </w:p>
+    <w:p>
+      <w:pPr>
+        <w:tabs>
+          <w:tab w:val="left" w:pos="6375"/>
+        </w:tabs>
+        <w:rPr>
+          <w:sz w:val="24"/>
+          <w:szCs w:val="24"/>
+        </w:rPr>
+      </w:pPr>
+      <w:r>
+        <w:rPr>
+          <w:sz w:val="24"/>
+          <w:szCs w:val="24"/>
+        </w:rPr>
+        <w:lastRenderedPageBreak/>
+        <w:t xml:space="preserve">47. inseríamos a </w:t>
+      </w:r>
+      <w:proofErr w:type="spellStart"/>
+      <w:r>
+        <w:rPr>
+          <w:sz w:val="24"/>
+          <w:szCs w:val="24"/>
+        </w:rPr>
+        <w:t>label</w:t>
+      </w:r>
+      <w:proofErr w:type="spellEnd"/>
+      <w:r>
+        <w:rPr>
+          <w:sz w:val="24"/>
+          <w:szCs w:val="24"/>
+        </w:rPr>
+        <w:t xml:space="preserve"> e o inputs tipo </w:t>
+      </w:r>
+      <w:proofErr w:type="spellStart"/>
+      <w:r>
+        <w:rPr>
+          <w:sz w:val="24"/>
+          <w:szCs w:val="24"/>
+        </w:rPr>
+        <w:t>checkbox</w:t>
+      </w:r>
+      <w:proofErr w:type="spellEnd"/>
+      <w:r>
+        <w:rPr>
+          <w:sz w:val="24"/>
+          <w:szCs w:val="24"/>
+        </w:rPr>
+        <w:t>.</w:t>
+      </w:r>
+    </w:p>
+    <w:p>
+      <w:pPr>
+        <w:tabs>
+          <w:tab w:val="left" w:pos="6375"/>
+        </w:tabs>
+        <w:rPr>
+          <w:sz w:val="24"/>
+          <w:szCs w:val="24"/>
+        </w:rPr>
+      </w:pPr>
+      <w:r>
+        <w:rPr>
+          <w:noProof/>
+          <w:sz w:val="24"/>
+          <w:szCs w:val="24"/>
+        </w:rPr>
+        <w:drawing>
+          <wp:inline distT="0" distB="0" distL="0" distR="0" wp14:anchorId="474E549B" wp14:editId="7996F964">
+            <wp:extent cx="5400040" cy="377190"/>
+            <wp:effectExtent l="0" t="0" r="0" b="3810"/>
+            <wp:docPr id="88" name="Imagem 88"/>
+            <wp:cNvGraphicFramePr>
+              <a:graphicFrameLocks xmlns:a="http://schemas.openxmlformats.org/drawingml/2006/main" noChangeAspect="1"/>
+            </wp:cNvGraphicFramePr>
+            <a:graphic xmlns:a="http://schemas.openxmlformats.org/drawingml/2006/main">
+              <a:graphicData uri="http://schemas.openxmlformats.org/drawingml/2006/picture">
+                <pic:pic xmlns:pic="http://schemas.openxmlformats.org/drawingml/2006/picture">
+                  <pic:nvPicPr>
+                    <pic:cNvPr id="1" name=""/>
+                    <pic:cNvPicPr/>
+                  </pic:nvPicPr>
+                  <pic:blipFill>
+                    <a:blip r:embed="rId78"/>
+                    <a:stretch>
+                      <a:fillRect/>
+                    </a:stretch>
+                  </pic:blipFill>
+                  <pic:spPr>
+                    <a:xfrm>
+                      <a:off x="0" y="0"/>
+                      <a:ext cx="5400040" cy="377190"/>
+                    </a:xfrm>
+                    <a:prstGeom prst="rect">
+                      <a:avLst/>
+                    </a:prstGeom>
+                  </pic:spPr>
+                </pic:pic>
+              </a:graphicData>
+            </a:graphic>
+          </wp:inline>
+        </w:drawing>
+      </w:r>
+    </w:p>
+    <w:p>
+      <w:pPr>
+        <w:tabs>
+          <w:tab w:val="left" w:pos="6375"/>
+        </w:tabs>
+        <w:rPr>
+          <w:sz w:val="24"/>
+          <w:szCs w:val="24"/>
+        </w:rPr>
+      </w:pPr>
+      <w:r>
+        <w:rPr>
+          <w:sz w:val="24"/>
+          <w:szCs w:val="24"/>
+        </w:rPr>
+        <w:drawing>
+          <wp:inline distT="0" distB="0" distL="0" distR="0" wp14:anchorId="4A0D7ECD" wp14:editId="09A7E5B2">
+            <wp:extent cx="4619625" cy="590550"/>
+            <wp:effectExtent l="0" t="0" r="9525" b="0"/>
+            <wp:docPr id="90" name="Imagem 90"/>
+            <wp:cNvGraphicFramePr>
+              <a:graphicFrameLocks xmlns:a="http://schemas.openxmlformats.org/drawingml/2006/main" noChangeAspect="1"/>
+            </wp:cNvGraphicFramePr>
+            <a:graphic xmlns:a="http://schemas.openxmlformats.org/drawingml/2006/main">
+              <a:graphicData uri="http://schemas.openxmlformats.org/drawingml/2006/picture">
+                <pic:pic xmlns:pic="http://schemas.openxmlformats.org/drawingml/2006/picture">
+                  <pic:nvPicPr>
+                    <pic:cNvPr id="1" name=""/>
+                    <pic:cNvPicPr/>
+                  </pic:nvPicPr>
+                  <pic:blipFill>
+                    <a:blip r:embed="rId79"/>
+                    <a:stretch>
+                      <a:fillRect/>
+                    </a:stretch>
+                  </pic:blipFill>
+                  <pic:spPr>
+                    <a:xfrm>
+                      <a:off x="0" y="0"/>
+                      <a:ext cx="4619625" cy="590550"/>
+                    </a:xfrm>
+                    <a:prstGeom prst="rect">
+                      <a:avLst/>
+                    </a:prstGeom>
+                  </pic:spPr>
+                </pic:pic>
+              </a:graphicData>
+            </a:graphic>
+          </wp:inline>
+        </w:drawing>
+      </w:r>
+    </w:p>
+    <w:p>
+      <w:pPr>
+        <w:tabs>
+          <w:tab w:val="left" w:pos="6375"/>
+        </w:tabs>
+        <w:rPr>
+          <w:sz w:val="24"/>
+          <w:szCs w:val="24"/>
+        </w:rPr>
+      </w:pPr>
+      <w:r>
+        <w:rPr>
+          <w:sz w:val="24"/>
+          <w:szCs w:val="24"/>
+        </w:rPr>
+        <w:t xml:space="preserve">48. </w:t>
+      </w:r>
+      <w:r>
+        <w:rPr>
+          <w:sz w:val="24"/>
+          <w:szCs w:val="24"/>
+        </w:rPr>
+        <w:t>Para colocar os inputs rádios-box e o input-</w:t>
+      </w:r>
+      <w:proofErr w:type="spellStart"/>
+      <w:r>
+        <w:rPr>
+          <w:sz w:val="24"/>
+          <w:szCs w:val="24"/>
+        </w:rPr>
+        <w:t>checkbox</w:t>
+      </w:r>
+      <w:proofErr w:type="spellEnd"/>
+      <w:r>
+        <w:rPr>
+          <w:sz w:val="24"/>
+          <w:szCs w:val="24"/>
+        </w:rPr>
+        <w:t xml:space="preserve"> na frente da </w:t>
+      </w:r>
+      <w:proofErr w:type="spellStart"/>
+      <w:r>
+        <w:rPr>
+          <w:sz w:val="24"/>
+          <w:szCs w:val="24"/>
+        </w:rPr>
+        <w:t>label</w:t>
+      </w:r>
+      <w:proofErr w:type="spellEnd"/>
+      <w:r>
+        <w:rPr>
+          <w:sz w:val="24"/>
+          <w:szCs w:val="24"/>
+        </w:rPr>
+        <w:t xml:space="preserve"> inseríamos o input dentro da </w:t>
+      </w:r>
+      <w:proofErr w:type="spellStart"/>
+      <w:r>
+        <w:rPr>
+          <w:sz w:val="24"/>
+          <w:szCs w:val="24"/>
+        </w:rPr>
+        <w:t>label</w:t>
+      </w:r>
+      <w:proofErr w:type="spellEnd"/>
+      <w:r>
+        <w:rPr>
+          <w:sz w:val="24"/>
+          <w:szCs w:val="24"/>
+        </w:rPr>
+        <w:t xml:space="preserve"> conforme o código abaixo:</w:t>
+      </w:r>
+    </w:p>
+    <w:p>
+      <w:pPr>
+        <w:tabs>
+          <w:tab w:val="left" w:pos="6375"/>
+        </w:tabs>
+        <w:rPr>
+          <w:sz w:val="24"/>
+          <w:szCs w:val="24"/>
+        </w:rPr>
+      </w:pPr>
+      <w:r>
+        <w:rPr>
+          <w:sz w:val="24"/>
+          <w:szCs w:val="24"/>
+        </w:rPr>
+        <w:drawing>
+          <wp:inline distT="0" distB="0" distL="0" distR="0" wp14:anchorId="2991C499" wp14:editId="6816F61C">
+            <wp:extent cx="5400040" cy="1385570"/>
+            <wp:effectExtent l="0" t="0" r="0" b="5080"/>
+            <wp:docPr id="89" name="Imagem 89"/>
+            <wp:cNvGraphicFramePr>
+              <a:graphicFrameLocks xmlns:a="http://schemas.openxmlformats.org/drawingml/2006/main" noChangeAspect="1"/>
+            </wp:cNvGraphicFramePr>
+            <a:graphic xmlns:a="http://schemas.openxmlformats.org/drawingml/2006/main">
+              <a:graphicData uri="http://schemas.openxmlformats.org/drawingml/2006/picture">
+                <pic:pic xmlns:pic="http://schemas.openxmlformats.org/drawingml/2006/picture">
+                  <pic:nvPicPr>
+                    <pic:cNvPr id="1" name=""/>
+                    <pic:cNvPicPr/>
+                  </pic:nvPicPr>
+                  <pic:blipFill>
+                    <a:blip r:embed="rId80"/>
+                    <a:stretch>
+                      <a:fillRect/>
+                    </a:stretch>
+                  </pic:blipFill>
+                  <pic:spPr>
+                    <a:xfrm>
+                      <a:off x="0" y="0"/>
+                      <a:ext cx="5400040" cy="1385570"/>
+                    </a:xfrm>
+                    <a:prstGeom prst="rect">
+                      <a:avLst/>
+                    </a:prstGeom>
+                  </pic:spPr>
+                </pic:pic>
+              </a:graphicData>
+            </a:graphic>
+          </wp:inline>
+        </w:drawing>
+      </w:r>
+    </w:p>
+    <w:p>
+      <w:pPr>
+        <w:tabs>
+          <w:tab w:val="left" w:pos="6375"/>
+        </w:tabs>
+        <w:rPr>
+          <w:sz w:val="24"/>
+          <w:szCs w:val="24"/>
+        </w:rPr>
+      </w:pPr>
+      <w:r>
+        <w:rPr>
+          <w:sz w:val="24"/>
+          <w:szCs w:val="24"/>
+        </w:rPr>
+        <w:t xml:space="preserve">49. </w:t>
+      </w:r>
+      <w:r>
+        <w:rPr>
+          <w:sz w:val="24"/>
+          <w:szCs w:val="24"/>
+        </w:rPr>
+        <w:t xml:space="preserve">Ao colocar os inputs dentro </w:t>
+      </w:r>
+      <w:proofErr w:type="spellStart"/>
+      <w:r>
+        <w:rPr>
+          <w:sz w:val="24"/>
+          <w:szCs w:val="24"/>
+        </w:rPr>
+        <w:t>labe</w:t>
+      </w:r>
+      <w:proofErr w:type="spellEnd"/>
+      <w:r>
+        <w:rPr>
+          <w:sz w:val="24"/>
+          <w:szCs w:val="24"/>
+        </w:rPr>
+        <w:t xml:space="preserve"> conforme o código acima se fez necessários criar uma </w:t>
+      </w:r>
+      <w:proofErr w:type="spellStart"/>
+      <w:r>
+        <w:rPr>
+          <w:sz w:val="24"/>
+          <w:szCs w:val="24"/>
+        </w:rPr>
+        <w:t>class</w:t>
+      </w:r>
+      <w:proofErr w:type="spellEnd"/>
+      <w:r>
+        <w:rPr>
+          <w:sz w:val="24"/>
+          <w:szCs w:val="24"/>
+        </w:rPr>
+        <w:t xml:space="preserve"> para formatar os outros inputs para coloca-los em </w:t>
+      </w:r>
+      <w:proofErr w:type="spellStart"/>
+      <w:r>
+        <w:rPr>
+          <w:sz w:val="24"/>
+          <w:szCs w:val="24"/>
+        </w:rPr>
+        <w:t>blok</w:t>
+      </w:r>
+      <w:proofErr w:type="spellEnd"/>
+    </w:p>
+    <w:p>
+      <w:pPr>
+        <w:tabs>
+          <w:tab w:val="left" w:pos="6375"/>
+        </w:tabs>
+        <w:rPr>
+          <w:sz w:val="24"/>
+          <w:szCs w:val="24"/>
+        </w:rPr>
+      </w:pPr>
+      <w:r>
+        <w:rPr>
+          <w:sz w:val="24"/>
+          <w:szCs w:val="24"/>
+        </w:rPr>
+        <w:drawing>
+          <wp:inline distT="0" distB="0" distL="0" distR="0" wp14:anchorId="290333A7" wp14:editId="7AE1439D">
+            <wp:extent cx="4441286" cy="1061049"/>
+            <wp:effectExtent l="0" t="0" r="0" b="6350"/>
+            <wp:docPr id="92" name="Imagem 92"/>
+            <wp:cNvGraphicFramePr>
+              <a:graphicFrameLocks xmlns:a="http://schemas.openxmlformats.org/drawingml/2006/main" noChangeAspect="1"/>
+            </wp:cNvGraphicFramePr>
+            <a:graphic xmlns:a="http://schemas.openxmlformats.org/drawingml/2006/main">
+              <a:graphicData uri="http://schemas.openxmlformats.org/drawingml/2006/picture">
+                <pic:pic xmlns:pic="http://schemas.openxmlformats.org/drawingml/2006/picture">
+                  <pic:nvPicPr>
+                    <pic:cNvPr id="1" name=""/>
+                    <pic:cNvPicPr/>
+                  </pic:nvPicPr>
+                  <pic:blipFill>
+                    <a:blip r:embed="rId81"/>
+                    <a:stretch>
+                      <a:fillRect/>
+                    </a:stretch>
+                  </pic:blipFill>
+                  <pic:spPr>
+                    <a:xfrm>
+                      <a:off x="0" y="0"/>
+                      <a:ext cx="5625819" cy="1344041"/>
+                    </a:xfrm>
+                    <a:prstGeom prst="rect">
+                      <a:avLst/>
+                    </a:prstGeom>
+                  </pic:spPr>
+                </pic:pic>
+              </a:graphicData>
+            </a:graphic>
+          </wp:inline>
+        </w:drawing>
+      </w:r>
+    </w:p>
+    <w:p>
+      <w:pPr>
+        <w:tabs>
+          <w:tab w:val="left" w:pos="6375"/>
+        </w:tabs>
+        <w:rPr>
+          <w:sz w:val="24"/>
+          <w:szCs w:val="24"/>
+        </w:rPr>
+      </w:pPr>
+      <w:r>
+        <w:rPr>
+          <w:sz w:val="24"/>
+          <w:szCs w:val="24"/>
+        </w:rPr>
+        <w:drawing>
+          <wp:inline distT="0" distB="0" distL="0" distR="0" wp14:anchorId="585184B9" wp14:editId="4A5DA3D1">
+            <wp:extent cx="2073910" cy="1198774"/>
+            <wp:effectExtent l="0" t="0" r="2540" b="1905"/>
+            <wp:docPr id="91" name="Imagem 91"/>
+            <wp:cNvGraphicFramePr>
+              <a:graphicFrameLocks xmlns:a="http://schemas.openxmlformats.org/drawingml/2006/main" noChangeAspect="1"/>
+            </wp:cNvGraphicFramePr>
+            <a:graphic xmlns:a="http://schemas.openxmlformats.org/drawingml/2006/main">
+              <a:graphicData uri="http://schemas.openxmlformats.org/drawingml/2006/picture">
+                <pic:pic xmlns:pic="http://schemas.openxmlformats.org/drawingml/2006/picture">
+                  <pic:nvPicPr>
+                    <pic:cNvPr id="1" name=""/>
+                    <pic:cNvPicPr/>
+                  </pic:nvPicPr>
+                  <pic:blipFill>
+                    <a:blip r:embed="rId82"/>
+                    <a:stretch>
+                      <a:fillRect/>
+                    </a:stretch>
+                  </pic:blipFill>
+                  <pic:spPr>
+                    <a:xfrm>
+                      <a:off x="0" y="0"/>
+                      <a:ext cx="2073910" cy="1198774"/>
+                    </a:xfrm>
+                    <a:prstGeom prst="rect">
+                      <a:avLst/>
+                    </a:prstGeom>
+                  </pic:spPr>
+                </pic:pic>
+              </a:graphicData>
+            </a:graphic>
+          </wp:inline>
+        </w:drawing>
+      </w:r>
+    </w:p>
+    <w:p>
+      <w:pPr>
+        <w:tabs>
+          <w:tab w:val="left" w:pos="6375"/>
+        </w:tabs>
+        <w:rPr>
+          <w:sz w:val="24"/>
+          <w:szCs w:val="24"/>
+        </w:rPr>
+      </w:pPr>
+      <w:r>
+        <w:rPr>
+          <w:noProof/>
+          <w:sz w:val="24"/>
+          <w:szCs w:val="24"/>
+        </w:rPr>
+        <mc:AlternateContent>
+          <mc:Choice Requires="wps">
+            <w:drawing>
+              <wp:anchor distT="0" distB="0" distL="114300" distR="114300" simplePos="0" relativeHeight="251697152" behindDoc="0" locked="0" layoutInCell="1" allowOverlap="1">
+                <wp:simplePos x="0" y="0"/>
+                <wp:positionH relativeFrom="column">
+                  <wp:posOffset>541631</wp:posOffset>
+                </wp:positionH>
+                <wp:positionV relativeFrom="paragraph">
+                  <wp:posOffset>189158</wp:posOffset>
+                </wp:positionV>
+                <wp:extent cx="845389" cy="1457864"/>
+                <wp:effectExtent l="38100" t="0" r="31115" b="47625"/>
+                <wp:wrapNone/>
+                <wp:docPr id="95" name="Conector de Seta Reta 95"/>
+                <wp:cNvGraphicFramePr/>
+                <a:graphic xmlns:a="http://schemas.openxmlformats.org/drawingml/2006/main">
+                  <a:graphicData uri="http://schemas.microsoft.com/office/word/2010/wordprocessingShape">
+                    <wps:wsp>
+                      <wps:cNvCnPr/>
+                      <wps:spPr>
+                        <a:xfrm flipH="1">
+                          <a:off x="0" y="0"/>
+                          <a:ext cx="845389" cy="1457864"/>
+                        </a:xfrm>
+                        <a:prstGeom prst="straightConnector1">
+                          <a:avLst/>
+                        </a:prstGeom>
+                        <a:ln>
+                          <a:tailEnd type="triangle"/>
+                        </a:ln>
+                      </wps:spPr>
+                      <wps:style>
+                        <a:lnRef idx="1">
+                          <a:schemeClr val="accent1"/>
+                        </a:lnRef>
+                        <a:fillRef idx="0">
+                          <a:schemeClr val="accent1"/>
+                        </a:fillRef>
+                        <a:effectRef idx="0">
+                          <a:schemeClr val="accent1"/>
+                        </a:effectRef>
+                        <a:fontRef idx="minor">
+                          <a:schemeClr val="tx1"/>
+                        </a:fontRef>
+                      </wps:style>
+                      <wps:bodyPr/>
+                    </wps:wsp>
+                  </a:graphicData>
+                </a:graphic>
+              </wp:anchor>
+            </w:drawing>
+          </mc:Choice>
+          <mc:Fallback>
+            <w:pict>
+              <v:shapetype w14:anchorId="303229A6" id="_x0000_t32" coordsize="21600,21600" o:spt="32" o:oned="t" path="m,l21600,21600e" filled="f">
+                <v:path arrowok="t" fillok="f" o:connecttype="none"/>
+                <o:lock v:ext="edit" shapetype="t"/>
+              </v:shapetype>
+              <v:shape id="Conector de Seta Reta 95" o:spid="_x0000_s1026" type="#_x0000_t32" style="position:absolute;margin-left:42.65pt;margin-top:14.9pt;width:66.55pt;height:114.8pt;flip:x;z-index:251697152;visibility:visible;mso-wrap-style:square;mso-wrap-distance-left:9pt;mso-wrap-distance-top:0;mso-wrap-distance-right:9pt;mso-wrap-distance-bottom:0;mso-position-horizontal:absolute;mso-position-horizontal-relative:text;mso-position-vertical:absolute;mso-position-vertical-relative:text" o:gfxdata="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" strokecolor="#4472c4 [3204]" strokeweight=".5pt">
+                <v:stroke endarrow="block" joinstyle="miter"/>
+              </v:shape>
+            </w:pict>
+          </mc:Fallback>
+        </mc:AlternateContent>
+      </w:r>
+      <w:r>
+        <w:rPr>
+          <w:sz w:val="24"/>
+          <w:szCs w:val="24"/>
+        </w:rPr>
+        <w:t xml:space="preserve">50. </w:t>
+      </w:r>
+      <w:r>
+        <w:rPr>
+          <w:sz w:val="24"/>
+          <w:szCs w:val="24"/>
+        </w:rPr>
+        <w:t xml:space="preserve">Adicionamos o </w:t>
+      </w:r>
+      <w:proofErr w:type="spellStart"/>
+      <w:r>
+        <w:rPr>
+          <w:sz w:val="24"/>
+          <w:szCs w:val="24"/>
+        </w:rPr>
+        <w:t>select</w:t>
+      </w:r>
+      <w:proofErr w:type="spellEnd"/>
+      <w:r>
+        <w:rPr>
+          <w:sz w:val="24"/>
+          <w:szCs w:val="24"/>
+        </w:rPr>
+        <w:t xml:space="preserve"> e a </w:t>
+      </w:r>
+      <w:proofErr w:type="spellStart"/>
+      <w:r>
+        <w:rPr>
+          <w:sz w:val="24"/>
+          <w:szCs w:val="24"/>
+        </w:rPr>
+        <w:t>legend</w:t>
+      </w:r>
+      <w:proofErr w:type="spellEnd"/>
+      <w:r>
+        <w:rPr>
+          <w:sz w:val="24"/>
+          <w:szCs w:val="24"/>
+        </w:rPr>
+        <w:t xml:space="preserve"> na nossa página conforme o código abaixo:</w:t>
+      </w:r>
+    </w:p>
+    <w:p>
+      <w:pPr>
+        <w:tabs>
+          <w:tab w:val="left" w:pos="6375"/>
+        </w:tabs>
+        <w:rPr>
+          <w:sz w:val="24"/>
+          <w:szCs w:val="24"/>
+        </w:rPr>
+      </w:pPr>
+      <w:r>
+        <w:rPr>
+          <w:sz w:val="24"/>
+          <w:szCs w:val="24"/>
+        </w:rPr>
+        <w:drawing>
+          <wp:inline distT="0" distB="0" distL="0" distR="0" wp14:anchorId="1A25ECB2" wp14:editId="6AA56E21">
+            <wp:extent cx="4096322" cy="1238423"/>
+            <wp:effectExtent l="0" t="0" r="0" b="0"/>
+            <wp:docPr id="93" name="Imagem 93"/>
+            <wp:cNvGraphicFramePr>
+              <a:graphicFrameLocks xmlns:a="http://schemas.openxmlformats.org/drawingml/2006/main" noChangeAspect="1"/>
+            </wp:cNvGraphicFramePr>
+            <a:graphic xmlns:a="http://schemas.openxmlformats.org/drawingml/2006/main">
+              <a:graphicData uri="http://schemas.openxmlformats.org/drawingml/2006/picture">
+                <pic:pic xmlns:pic="http://schemas.openxmlformats.org/drawingml/2006/picture">
+                  <pic:nvPicPr>
+                    <pic:cNvPr id="1" name=""/>
+                    <pic:cNvPicPr/>
+                  </pic:nvPicPr>
+                  <pic:blipFill>
+                    <a:blip r:embed="rId83"/>
+                    <a:stretch>
+                      <a:fillRect/>
+                    </a:stretch>
+                  </pic:blipFill>
+                  <pic:spPr>
+                    <a:xfrm>
+                      <a:off x="0" y="0"/>
+                      <a:ext cx="4096322" cy="1238423"/>
+                    </a:xfrm>
+                    <a:prstGeom prst="rect">
+                      <a:avLst/>
+                    </a:prstGeom>
+                  </pic:spPr>
+                </pic:pic>
+              </a:graphicData>
+            </a:graphic>
+          </wp:inline>
+        </w:drawing>
+      </w:r>
+    </w:p>
+    <w:p>
+      <w:pPr>
+        <w:tabs>
+          <w:tab w:val="left" w:pos="6375"/>
+        </w:tabs>
+        <w:rPr>
+          <w:sz w:val="24"/>
+          <w:szCs w:val="24"/>
+        </w:rPr>
+      </w:pPr>
+      <w:r>
+        <w:rPr>
+          <w:sz w:val="24"/>
+          <w:szCs w:val="24"/>
+        </w:rPr>
+        <w:drawing>
+          <wp:inline distT="0" distB="0" distL="0" distR="0" wp14:anchorId="7E2F7290" wp14:editId="1028B8CE">
+            <wp:extent cx="4029637" cy="495369"/>
+            <wp:effectExtent l="0" t="0" r="9525" b="0"/>
+            <wp:docPr id="94" name="Imagem 94"/>
+            <wp:cNvGraphicFramePr>
+              <a:graphicFrameLocks xmlns:a="http://schemas.openxmlformats.org/drawingml/2006/main" noChangeAspect="1"/>
+            </wp:cNvGraphicFramePr>
+            <a:graphic xmlns:a="http://schemas.openxmlformats.org/drawingml/2006/main">
+              <a:graphicData uri="http://schemas.openxmlformats.org/drawingml/2006/picture">
+                <pic:pic xmlns:pic="http://schemas.openxmlformats.org/drawingml/2006/picture">
+                  <pic:nvPicPr>
+                    <pic:cNvPr id="1" name=""/>
+                    <pic:cNvPicPr/>
+                  </pic:nvPicPr>
+                  <pic:blipFill>
+                    <a:blip r:embed="rId84"/>
+                    <a:stretch>
+                      <a:fillRect/>
+                    </a:stretch>
+                  </pic:blipFill>
+                  <pic:spPr>
+                    <a:xfrm>
+                      <a:off x="0" y="0"/>
+                      <a:ext cx="4029637" cy="495369"/>
+                    </a:xfrm>
+                    <a:prstGeom prst="rect">
+                      <a:avLst/>
+                    </a:prstGeom>
+                  </pic:spPr>
+                </pic:pic>
+              </a:graphicData>
+            </a:graphic>
+          </wp:inline>
+        </w:drawing>
+      </w:r>
+    </w:p>
+    <w:p>
+      <w:pPr>
+        <w:tabs>
+          <w:tab w:val="left" w:pos="6375"/>
+        </w:tabs>
+        <w:rPr>
+          <w:sz w:val="24"/>
+          <w:szCs w:val="24"/>
+        </w:rPr>
+      </w:pPr>
+      <w:r>
+        <w:rPr>
+          <w:sz w:val="24"/>
+          <w:szCs w:val="24"/>
+        </w:rPr>
+        <w:lastRenderedPageBreak/>
+        <w:t xml:space="preserve">51. Colocamos um espaço externo para cima e para baixo no </w:t>
+      </w:r>
+      <w:proofErr w:type="spellStart"/>
+      <w:r>
+        <w:rPr>
+          <w:sz w:val="24"/>
+          <w:szCs w:val="24"/>
+        </w:rPr>
+        <w:t>checkbox</w:t>
+      </w:r>
+      <w:proofErr w:type="spellEnd"/>
+      <w:r>
+        <w:rPr>
+          <w:sz w:val="24"/>
+          <w:szCs w:val="24"/>
+        </w:rPr>
+        <w:t xml:space="preserve"> conforme código.</w:t>
+      </w:r>
+      <w:r>
+        <w:rPr>
+          <w:noProof/>
+        </w:rPr>
+        <w:t xml:space="preserve"> </w:t>
+      </w:r>
+    </w:p>
+    <w:p>
+      <w:pPr>
+        <w:tabs>
+          <w:tab w:val="left" w:pos="6375"/>
+        </w:tabs>
+        <w:rPr>
+          <w:sz w:val="24"/>
+          <w:szCs w:val="24"/>
+        </w:rPr>
+      </w:pPr>
+      <w:r>
+        <w:rPr>
+          <w:sz w:val="24"/>
+          <w:szCs w:val="24"/>
+        </w:rPr>
+        <w:drawing>
+          <wp:inline distT="0" distB="0" distL="0" distR="0" wp14:anchorId="4BAE6CBF" wp14:editId="0AB69DB5">
+            <wp:extent cx="1657581" cy="733527"/>
+            <wp:effectExtent l="0" t="0" r="0" b="9525"/>
+            <wp:docPr id="97" name="Imagem 97"/>
+            <wp:cNvGraphicFramePr>
+              <a:graphicFrameLocks xmlns:a="http://schemas.openxmlformats.org/drawingml/2006/main" noChangeAspect="1"/>
+            </wp:cNvGraphicFramePr>
+            <a:graphic xmlns:a="http://schemas.openxmlformats.org/drawingml/2006/main">
+              <a:graphicData uri="http://schemas.openxmlformats.org/drawingml/2006/picture">
+                <pic:pic xmlns:pic="http://schemas.openxmlformats.org/drawingml/2006/picture">
+                  <pic:nvPicPr>
+                    <pic:cNvPr id="1" name=""/>
+                    <pic:cNvPicPr/>
+                  </pic:nvPicPr>
+                  <pic:blipFill>
+                    <a:blip r:embed="rId85"/>
+                    <a:stretch>
+                      <a:fillRect/>
+                    </a:stretch>
+                  </pic:blipFill>
+                  <pic:spPr>
+                    <a:xfrm>
+                      <a:off x="0" y="0"/>
+                      <a:ext cx="1657581" cy="733527"/>
+                    </a:xfrm>
+                    <a:prstGeom prst="rect">
+                      <a:avLst/>
+                    </a:prstGeom>
+                  </pic:spPr>
+                </pic:pic>
+              </a:graphicData>
+            </a:graphic>
+          </wp:inline>
+        </w:drawing>
+      </w:r>
+      <w:r>
+        <w:rPr>
+          <w:sz w:val="24"/>
+          <w:szCs w:val="24"/>
+        </w:rPr>
+        <w:drawing>
+          <wp:inline distT="0" distB="0" distL="0" distR="0" wp14:anchorId="2EA587B4" wp14:editId="6E19FF45">
+            <wp:extent cx="2665562" cy="738348"/>
+            <wp:effectExtent l="0" t="0" r="1905" b="5080"/>
+            <wp:docPr id="98" name="Imagem 98"/>
+            <wp:cNvGraphicFramePr>
+              <a:graphicFrameLocks xmlns:a="http://schemas.openxmlformats.org/drawingml/2006/main" noChangeAspect="1"/>
+            </wp:cNvGraphicFramePr>
+            <a:graphic xmlns:a="http://schemas.openxmlformats.org/drawingml/2006/main">
+              <a:graphicData uri="http://schemas.openxmlformats.org/drawingml/2006/picture">
+                <pic:pic xmlns:pic="http://schemas.openxmlformats.org/drawingml/2006/picture">
+                  <pic:nvPicPr>
+                    <pic:cNvPr id="1" name=""/>
+                    <pic:cNvPicPr/>
+                  </pic:nvPicPr>
+                  <pic:blipFill>
+                    <a:blip r:embed="rId86"/>
+                    <a:stretch>
+                      <a:fillRect/>
+                    </a:stretch>
+                  </pic:blipFill>
+                  <pic:spPr>
+                    <a:xfrm>
+                      <a:off x="0" y="0"/>
+                      <a:ext cx="2788293" cy="772344"/>
+                    </a:xfrm>
+                    <a:prstGeom prst="rect">
+                      <a:avLst/>
+                    </a:prstGeom>
+                  </pic:spPr>
+                </pic:pic>
+              </a:graphicData>
+            </a:graphic>
+          </wp:inline>
+        </w:drawing>
+      </w:r>
+    </w:p>
+    <w:p>
+      <w:pPr>
+        <w:tabs>
+          <w:tab w:val="left" w:pos="6375"/>
+        </w:tabs>
+        <w:rPr>
+          <w:sz w:val="24"/>
+          <w:szCs w:val="24"/>
+        </w:rPr>
+      </w:pPr>
+      <w:r>
+        <w:rPr>
+          <w:sz w:val="24"/>
+          <w:szCs w:val="24"/>
+        </w:rPr>
+        <w:drawing>
+          <wp:inline distT="0" distB="0" distL="0" distR="0" wp14:anchorId="7A5D816A" wp14:editId="0E3AF15E">
+            <wp:extent cx="5400040" cy="344805"/>
+            <wp:effectExtent l="0" t="0" r="0" b="0"/>
+            <wp:docPr id="100" name="Imagem 100"/>
+            <wp:cNvGraphicFramePr>
+              <a:graphicFrameLocks xmlns:a="http://schemas.openxmlformats.org/drawingml/2006/main" noChangeAspect="1"/>
+            </wp:cNvGraphicFramePr>
+            <a:graphic xmlns:a="http://schemas.openxmlformats.org/drawingml/2006/main">
+              <a:graphicData uri="http://schemas.openxmlformats.org/drawingml/2006/picture">
+                <pic:pic xmlns:pic="http://schemas.openxmlformats.org/drawingml/2006/picture">
+                  <pic:nvPicPr>
+                    <pic:cNvPr id="1" name=""/>
+                    <pic:cNvPicPr/>
+                  </pic:nvPicPr>
+                  <pic:blipFill>
+                    <a:blip r:embed="rId87"/>
+                    <a:stretch>
+                      <a:fillRect/>
+                    </a:stretch>
+                  </pic:blipFill>
+                  <pic:spPr>
+                    <a:xfrm>
+                      <a:off x="0" y="0"/>
+                      <a:ext cx="5400040" cy="344805"/>
+                    </a:xfrm>
+                    <a:prstGeom prst="rect">
+                      <a:avLst/>
+                    </a:prstGeom>
+                  </pic:spPr>
+                </pic:pic>
+              </a:graphicData>
+            </a:graphic>
+          </wp:inline>
+        </w:drawing>
+      </w:r>
+    </w:p>
+    <w:p>
+      <w:pPr>
+        <w:tabs>
+          <w:tab w:val="left" w:pos="6375"/>
+        </w:tabs>
+        <w:rPr>
+          <w:noProof/>
+        </w:rPr>
+      </w:pPr>
+      <w:r>
+        <w:rPr>
+          <w:noProof/>
+          <w:sz w:val="24"/>
+          <w:szCs w:val="24"/>
+        </w:rPr>
+        <mc:AlternateContent>
+          <mc:Choice Requires="wps">
+            <w:drawing>
+              <wp:anchor distT="0" distB="0" distL="114300" distR="114300" simplePos="0" relativeHeight="251699200" behindDoc="0" locked="0" layoutInCell="1" allowOverlap="1">
+                <wp:simplePos x="0" y="0"/>
+                <wp:positionH relativeFrom="column">
+                  <wp:posOffset>438114</wp:posOffset>
+                </wp:positionH>
+                <wp:positionV relativeFrom="paragraph">
+                  <wp:posOffset>373367</wp:posOffset>
+                </wp:positionV>
+                <wp:extent cx="353683" cy="1009291"/>
+                <wp:effectExtent l="0" t="0" r="66040" b="57785"/>
+                <wp:wrapNone/>
+                <wp:docPr id="103" name="Conector de Seta Reta 103"/>
+                <wp:cNvGraphicFramePr/>
+                <a:graphic xmlns:a="http://schemas.openxmlformats.org/drawingml/2006/main">
+                  <a:graphicData uri="http://schemas.microsoft.com/office/word/2010/wordprocessingShape">
+                    <wps:wsp>
+                      <wps:cNvCnPr/>
+                      <wps:spPr>
+                        <a:xfrm>
+                          <a:off x="0" y="0"/>
+                          <a:ext cx="353683" cy="1009291"/>
+                        </a:xfrm>
+                        <a:prstGeom prst="straightConnector1">
+                          <a:avLst/>
+                        </a:prstGeom>
+                        <a:ln>
+                          <a:tailEnd type="triangle"/>
+                        </a:ln>
+                      </wps:spPr>
+                      <wps:style>
+                        <a:lnRef idx="1">
+                          <a:schemeClr val="accent1"/>
+                        </a:lnRef>
+                        <a:fillRef idx="0">
+                          <a:schemeClr val="accent1"/>
+                        </a:fillRef>
+                        <a:effectRef idx="0">
+                          <a:schemeClr val="accent1"/>
+                        </a:effectRef>
+                        <a:fontRef idx="minor">
+                          <a:schemeClr val="tx1"/>
+                        </a:fontRef>
+                      </wps:style>
+                      <wps:bodyPr/>
+                    </wps:wsp>
+                  </a:graphicData>
+                </a:graphic>
+              </wp:anchor>
+            </w:drawing>
+          </mc:Choice>
+          <mc:Fallback>
+            <w:pict>
+              <v:shape w14:anchorId="6FDFC309" id="Conector de Seta Reta 103" o:spid="_x0000_s1026" type="#_x0000_t32" style="position:absolute;margin-left:34.5pt;margin-top:29.4pt;width:27.85pt;height:79.45pt;z-index:251699200;visibility:visible;mso-wrap-style:square;mso-wrap-distance-left:9pt;mso-wrap-distance-top:0;mso-wrap-distance-right:9pt;mso-wrap-distance-bottom:0;mso-position-horizontal:absolute;mso-position-horizontal-relative:text;mso-position-vertical:absolute;mso-position-vertical-relative:text" o:gfxdata="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" strokecolor="#4472c4 [3204]" strokeweight=".5pt">
+                <v:stroke endarrow="block" joinstyle="miter"/>
+              </v:shape>
+            </w:pict>
+          </mc:Fallback>
+        </mc:AlternateContent>
+      </w:r>
+      <w:r>
+        <w:rPr>
+          <w:noProof/>
+          <w:sz w:val="24"/>
+          <w:szCs w:val="24"/>
+        </w:rPr>
+        <mc:AlternateContent>
+          <mc:Choice Requires="wps">
+            <w:drawing>
+              <wp:anchor distT="0" distB="0" distL="114300" distR="114300" simplePos="0" relativeHeight="251698176" behindDoc="0" locked="0" layoutInCell="1" allowOverlap="1">
+                <wp:simplePos x="0" y="0"/>
+                <wp:positionH relativeFrom="column">
+                  <wp:posOffset>179322</wp:posOffset>
+                </wp:positionH>
+                <wp:positionV relativeFrom="paragraph">
+                  <wp:posOffset>381994</wp:posOffset>
+                </wp:positionV>
+                <wp:extent cx="1354347" cy="603849"/>
+                <wp:effectExtent l="0" t="0" r="93980" b="63500"/>
+                <wp:wrapNone/>
+                <wp:docPr id="102" name="Conector de Seta Reta 102"/>
+                <wp:cNvGraphicFramePr/>
+                <a:graphic xmlns:a="http://schemas.openxmlformats.org/drawingml/2006/main">
+                  <a:graphicData uri="http://schemas.microsoft.com/office/word/2010/wordprocessingShape">
+                    <wps:wsp>
+                      <wps:cNvCnPr/>
+                      <wps:spPr>
+                        <a:xfrm>
+                          <a:off x="0" y="0"/>
+                          <a:ext cx="1354347" cy="603849"/>
+                        </a:xfrm>
+                        <a:prstGeom prst="straightConnector1">
+                          <a:avLst/>
+                        </a:prstGeom>
+                        <a:ln>
+                          <a:tailEnd type="triangle"/>
+                        </a:ln>
+                      </wps:spPr>
+                      <wps:style>
+                        <a:lnRef idx="1">
+                          <a:schemeClr val="accent1"/>
+                        </a:lnRef>
+                        <a:fillRef idx="0">
+                          <a:schemeClr val="accent1"/>
+                        </a:fillRef>
+                        <a:effectRef idx="0">
+                          <a:schemeClr val="accent1"/>
+                        </a:effectRef>
+                        <a:fontRef idx="minor">
+                          <a:schemeClr val="tx1"/>
+                        </a:fontRef>
+                      </wps:style>
+                      <wps:bodyPr/>
+                    </wps:wsp>
+                  </a:graphicData>
+                </a:graphic>
+                <wp14:sizeRelH relativeFrom="margin">
+                  <wp14:pctWidth>0</wp14:pctWidth>
+                </wp14:sizeRelH>
+                <wp14:sizeRelV relativeFrom="margin">
+                  <wp14:pctHeight>0</wp14:pctHeight>
+                </wp14:sizeRelV>
+              </wp:anchor>
+            </w:drawing>
+          </mc:Choice>
+          <mc:Fallback>
+            <w:pict>
+              <v:shape w14:anchorId="68738779" id="Conector de Seta Reta 102" o:spid="_x0000_s1026" type="#_x0000_t32" style="position:absolute;margin-left:14.1pt;margin-top:30.1pt;width:106.65pt;height:47.55pt;z-index:251698176;visibility:visible;mso-wrap-style:square;mso-width-percent:0;mso-height-percent:0;mso-wrap-distance-left:9pt;mso-wrap-distance-top:0;mso-wrap-distance-right:9pt;mso-wrap-distance-bottom:0;mso-position-horizontal:absolute;mso-position-horizontal-relative:text;mso-position-vertical:absolute;mso-position-vertical-relative:text;mso-width-percent:0;mso-height-percent:0;mso-width-relative:margin;mso-height-relative:margin" o:gfxdata="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" strokecolor="#4472c4 [3204]" strokeweight=".5pt">
+                <v:stroke endarrow="block" joinstyle="miter"/>
+              </v:shape>
+            </w:pict>
+          </mc:Fallback>
+        </mc:AlternateContent>
+      </w:r>
+      <w:r>
+        <w:rPr>
+          <w:sz w:val="24"/>
+          <w:szCs w:val="24"/>
+        </w:rPr>
+        <w:t xml:space="preserve">52. Trocamos os tipos de inputs de </w:t>
+      </w:r>
+      <w:proofErr w:type="spellStart"/>
+      <w:r>
+        <w:rPr>
+          <w:sz w:val="24"/>
+          <w:szCs w:val="24"/>
+        </w:rPr>
+        <w:t>text</w:t>
+      </w:r>
+      <w:proofErr w:type="spellEnd"/>
+      <w:r>
+        <w:rPr>
+          <w:sz w:val="24"/>
+          <w:szCs w:val="24"/>
+        </w:rPr>
+        <w:t xml:space="preserve"> para os seus respectivos como por exemplo e-mail, </w:t>
+      </w:r>
+      <w:proofErr w:type="spellStart"/>
+      <w:r>
+        <w:rPr>
+          <w:sz w:val="24"/>
+          <w:szCs w:val="24"/>
+        </w:rPr>
+        <w:t>tel</w:t>
+      </w:r>
+      <w:proofErr w:type="spellEnd"/>
+      <w:r>
+        <w:rPr>
+          <w:sz w:val="24"/>
+          <w:szCs w:val="24"/>
+        </w:rPr>
+        <w:t xml:space="preserve"> para telefone.</w:t>
+      </w:r>
+      <w:r>
+        <w:rPr>
+          <w:noProof/>
+        </w:rPr>
+        <w:t xml:space="preserve"> </w:t>
+      </w:r>
+      <w:r>
+        <w:rPr>
+          <w:sz w:val="24"/>
+          <w:szCs w:val="24"/>
+        </w:rPr>
+        <w:drawing>
+          <wp:inline distT="0" distB="0" distL="0" distR="0" wp14:anchorId="78A2F7B6" wp14:editId="09DC9CD4">
+            <wp:extent cx="5400040" cy="1187450"/>
+            <wp:effectExtent l="0" t="0" r="0" b="0"/>
+            <wp:docPr id="101" name="Imagem 101"/>
+            <wp:cNvGraphicFramePr>
+              <a:graphicFrameLocks xmlns:a="http://schemas.openxmlformats.org/drawingml/2006/main" noChangeAspect="1"/>
+            </wp:cNvGraphicFramePr>
+            <a:graphic xmlns:a="http://schemas.openxmlformats.org/drawingml/2006/main">
+              <a:graphicData uri="http://schemas.openxmlformats.org/drawingml/2006/picture">
+                <pic:pic xmlns:pic="http://schemas.openxmlformats.org/drawingml/2006/picture">
+                  <pic:nvPicPr>
+                    <pic:cNvPr id="1" name=""/>
+                    <pic:cNvPicPr/>
+                  </pic:nvPicPr>
+                  <pic:blipFill>
+                    <a:blip r:embed="rId88"/>
+                    <a:stretch>
+                      <a:fillRect/>
+                    </a:stretch>
+                  </pic:blipFill>
+                  <pic:spPr>
+                    <a:xfrm>
+                      <a:off x="0" y="0"/>
+                      <a:ext cx="5400040" cy="1187450"/>
+                    </a:xfrm>
+                    <a:prstGeom prst="rect">
+                      <a:avLst/>
+                    </a:prstGeom>
+                  </pic:spPr>
+                </pic:pic>
+              </a:graphicData>
+            </a:graphic>
+          </wp:inline>
+        </w:drawing>
+      </w:r>
+    </w:p>
+    <w:p>
+      <w:pPr>
+        <w:tabs>
+          <w:tab w:val="left" w:pos="6375"/>
+        </w:tabs>
+        <w:rPr>
+          <w:noProof/>
+        </w:rPr>
+      </w:pPr>
+      <w:r>
+        <w:rPr>
+          <w:noProof/>
+          <w:sz w:val="24"/>
+          <w:szCs w:val="24"/>
+        </w:rPr>
+        <mc:AlternateContent>
+          <mc:Choice Requires="wps">
+            <w:drawing>
+              <wp:anchor distT="0" distB="0" distL="114300" distR="114300" simplePos="0" relativeHeight="251701248" behindDoc="0" locked="0" layoutInCell="1" allowOverlap="1">
+                <wp:simplePos x="0" y="0"/>
+                <wp:positionH relativeFrom="column">
+                  <wp:posOffset>1104265</wp:posOffset>
+                </wp:positionH>
+                <wp:positionV relativeFrom="paragraph">
+                  <wp:posOffset>314960</wp:posOffset>
+                </wp:positionV>
+                <wp:extent cx="3721100" cy="641350"/>
+                <wp:effectExtent l="0" t="0" r="31750" b="82550"/>
+                <wp:wrapNone/>
+                <wp:docPr id="106" name="Conector de Seta Reta 106"/>
+                <wp:cNvGraphicFramePr/>
+                <a:graphic xmlns:a="http://schemas.openxmlformats.org/drawingml/2006/main">
+                  <a:graphicData uri="http://schemas.microsoft.com/office/word/2010/wordprocessingShape">
+                    <wps:wsp>
+                      <wps:cNvCnPr/>
+                      <wps:spPr>
+                        <a:xfrm>
+                          <a:off x="0" y="0"/>
+                          <a:ext cx="3721100" cy="641350"/>
+                        </a:xfrm>
+                        <a:prstGeom prst="straightConnector1">
+                          <a:avLst/>
+                        </a:prstGeom>
+                        <a:ln>
+                          <a:tailEnd type="triangle"/>
+                        </a:ln>
+                      </wps:spPr>
+                      <wps:style>
+                        <a:lnRef idx="1">
+                          <a:schemeClr val="accent1"/>
+                        </a:lnRef>
+                        <a:fillRef idx="0">
+                          <a:schemeClr val="accent1"/>
+                        </a:fillRef>
+                        <a:effectRef idx="0">
+                          <a:schemeClr val="accent1"/>
+                        </a:effectRef>
+                        <a:fontRef idx="minor">
+                          <a:schemeClr val="tx1"/>
+                        </a:fontRef>
+                      </wps:style>
+                      <wps:bodyPr/>
+                    </wps:wsp>
+                  </a:graphicData>
+                </a:graphic>
+                <wp14:sizeRelH relativeFrom="margin">
+                  <wp14:pctWidth>0</wp14:pctWidth>
+                </wp14:sizeRelH>
+                <wp14:sizeRelV relativeFrom="margin">
+                  <wp14:pctHeight>0</wp14:pctHeight>
+                </wp14:sizeRelV>
+              </wp:anchor>
+            </w:drawing>
+          </mc:Choice>
+          <mc:Fallback>
+            <w:pict>
+              <v:shape w14:anchorId="491CEDF8" id="Conector de Seta Reta 106" o:spid="_x0000_s1026" type="#_x0000_t32" style="position:absolute;margin-left:86.95pt;margin-top:24.8pt;width:293pt;height:50.5pt;z-index:251701248;visibility:visible;mso-wrap-style:square;mso-width-percent:0;mso-height-percent:0;mso-wrap-distance-left:9pt;mso-wrap-distance-top:0;mso-wrap-distance-right:9pt;mso-wrap-distance-bottom:0;mso-position-horizontal:absolute;mso-position-horizontal-relative:text;mso-position-vertical:absolute;mso-position-vertical-relative:text;mso-width-percent:0;mso-height-percent:0;mso-width-relative:margin;mso-height-relative:margin" o:gfxdata="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" strokecolor="#4472c4 [3204]" strokeweight=".5pt">
+                <v:stroke endarrow="block" joinstyle="miter"/>
+              </v:shape>
+            </w:pict>
+          </mc:Fallback>
+        </mc:AlternateContent>
+      </w:r>
+      <w:r>
+        <w:rPr>
+          <w:noProof/>
+          <w:sz w:val="24"/>
+          <w:szCs w:val="24"/>
+        </w:rPr>
+        <mc:AlternateContent>
+          <mc:Choice Requires="wps">
+            <w:drawing>
+              <wp:anchor distT="0" distB="0" distL="114300" distR="114300" simplePos="0" relativeHeight="251702272" behindDoc="0" locked="0" layoutInCell="1" allowOverlap="1">
+                <wp:simplePos x="0" y="0"/>
+                <wp:positionH relativeFrom="column">
+                  <wp:posOffset>1110615</wp:posOffset>
+                </wp:positionH>
+                <wp:positionV relativeFrom="paragraph">
+                  <wp:posOffset>314960</wp:posOffset>
+                </wp:positionV>
+                <wp:extent cx="3975100" cy="1003300"/>
+                <wp:effectExtent l="0" t="0" r="44450" b="82550"/>
+                <wp:wrapNone/>
+                <wp:docPr id="107" name="Conector de Seta Reta 107"/>
+                <wp:cNvGraphicFramePr/>
+                <a:graphic xmlns:a="http://schemas.openxmlformats.org/drawingml/2006/main">
+                  <a:graphicData uri="http://schemas.microsoft.com/office/word/2010/wordprocessingShape">
+                    <wps:wsp>
+                      <wps:cNvCnPr/>
+                      <wps:spPr>
+                        <a:xfrm>
+                          <a:off x="0" y="0"/>
+                          <a:ext cx="3975100" cy="1003300"/>
+                        </a:xfrm>
+                        <a:prstGeom prst="straightConnector1">
+                          <a:avLst/>
+                        </a:prstGeom>
+                        <a:ln>
+                          <a:tailEnd type="triangle"/>
+                        </a:ln>
+                      </wps:spPr>
+                      <wps:style>
+                        <a:lnRef idx="1">
+                          <a:schemeClr val="accent1"/>
+                        </a:lnRef>
+                        <a:fillRef idx="0">
+                          <a:schemeClr val="accent1"/>
+                        </a:fillRef>
+                        <a:effectRef idx="0">
+                          <a:schemeClr val="accent1"/>
+                        </a:effectRef>
+                        <a:fontRef idx="minor">
+                          <a:schemeClr val="tx1"/>
+                        </a:fontRef>
+                      </wps:style>
+                      <wps:bodyPr/>
+                    </wps:wsp>
+                  </a:graphicData>
+                </a:graphic>
+                <wp14:sizeRelH relativeFrom="margin">
+                  <wp14:pctWidth>0</wp14:pctWidth>
+                </wp14:sizeRelH>
+                <wp14:sizeRelV relativeFrom="margin">
+                  <wp14:pctHeight>0</wp14:pctHeight>
+                </wp14:sizeRelV>
+              </wp:anchor>
+            </w:drawing>
+          </mc:Choice>
+          <mc:Fallback>
+            <w:pict>
+              <v:shape w14:anchorId="07AD7026" id="Conector de Seta Reta 107" o:spid="_x0000_s1026" type="#_x0000_t32" style="position:absolute;margin-left:87.45pt;margin-top:24.8pt;width:313pt;height:79pt;z-index:251702272;visibility:visible;mso-wrap-style:square;mso-width-percent:0;mso-height-percent:0;mso-wrap-distance-left:9pt;mso-wrap-distance-top:0;mso-wrap-distance-right:9pt;mso-wrap-distance-bottom:0;mso-position-horizontal:absolute;mso-position-horizontal-relative:text;mso-position-vertical:absolute;mso-position-vertical-relative:text;mso-width-percent:0;mso-height-percent:0;mso-width-relative:margin;mso-height-relative:margin" o:gfxdata="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" strokecolor="#4472c4 [3204]" strokeweight=".5pt">
+                <v:stroke endarrow="block" joinstyle="miter"/>
+              </v:shape>
+            </w:pict>
+          </mc:Fallback>
+        </mc:AlternateContent>
+      </w:r>
+      <w:r>
+        <w:rPr>
+          <w:noProof/>
+          <w:sz w:val="24"/>
+          <w:szCs w:val="24"/>
+        </w:rPr>
+        <mc:AlternateContent>
+          <mc:Choice Requires="wps">
+            <w:drawing>
+              <wp:anchor distT="0" distB="0" distL="114300" distR="114300" simplePos="0" relativeHeight="251700224" behindDoc="0" locked="0" layoutInCell="1" allowOverlap="1">
+                <wp:simplePos x="0" y="0"/>
+                <wp:positionH relativeFrom="column">
+                  <wp:posOffset>1123315</wp:posOffset>
+                </wp:positionH>
+                <wp:positionV relativeFrom="paragraph">
+                  <wp:posOffset>321310</wp:posOffset>
+                </wp:positionV>
+                <wp:extent cx="3898900" cy="234950"/>
+                <wp:effectExtent l="0" t="0" r="44450" b="88900"/>
+                <wp:wrapNone/>
+                <wp:docPr id="105" name="Conector de Seta Reta 105"/>
+                <wp:cNvGraphicFramePr/>
+                <a:graphic xmlns:a="http://schemas.openxmlformats.org/drawingml/2006/main">
+                  <a:graphicData uri="http://schemas.microsoft.com/office/word/2010/wordprocessingShape">
+                    <wps:wsp>
+                      <wps:cNvCnPr/>
+                      <wps:spPr>
+                        <a:xfrm>
+                          <a:off x="0" y="0"/>
+                          <a:ext cx="3898900" cy="234950"/>
+                        </a:xfrm>
+                        <a:prstGeom prst="straightConnector1">
+                          <a:avLst/>
+                        </a:prstGeom>
+                        <a:ln>
+                          <a:tailEnd type="triangle"/>
+                        </a:ln>
+                      </wps:spPr>
+                      <wps:style>
+                        <a:lnRef idx="1">
+                          <a:schemeClr val="accent1"/>
+                        </a:lnRef>
+                        <a:fillRef idx="0">
+                          <a:schemeClr val="accent1"/>
+                        </a:fillRef>
+                        <a:effectRef idx="0">
+                          <a:schemeClr val="accent1"/>
+                        </a:effectRef>
+                        <a:fontRef idx="minor">
+                          <a:schemeClr val="tx1"/>
+                        </a:fontRef>
+                      </wps:style>
+                      <wps:bodyPr/>
+                    </wps:wsp>
+                  </a:graphicData>
+                </a:graphic>
+                <wp14:sizeRelH relativeFrom="margin">
+                  <wp14:pctWidth>0</wp14:pctWidth>
+                </wp14:sizeRelH>
+                <wp14:sizeRelV relativeFrom="margin">
+                  <wp14:pctHeight>0</wp14:pctHeight>
+                </wp14:sizeRelV>
+              </wp:anchor>
+            </w:drawing>
+          </mc:Choice>
+          <mc:Fallback>
+            <w:pict>
+              <v:shape w14:anchorId="3375C1EC" id="Conector de Seta Reta 105" o:spid="_x0000_s1026" type="#_x0000_t32" style="position:absolute;margin-left:88.45pt;margin-top:25.3pt;width:307pt;height:18.5pt;z-index:251700224;visibility:visible;mso-wrap-style:square;mso-width-percent:0;mso-height-percent:0;mso-wrap-distance-left:9pt;mso-wrap-distance-top:0;mso-wrap-distance-right:9pt;mso-wrap-distance-bottom:0;mso-position-horizontal:absolute;mso-position-horizontal-relative:text;mso-position-vertical:absolute;mso-position-vertical-relative:text;mso-width-percent:0;mso-height-percent:0;mso-width-relative:margin;mso-height-relative:margin" o:gfxdata="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" strokecolor="#4472c4 [3204]" strokeweight=".5pt">
+                <v:stroke endarrow="block" joinstyle="miter"/>
+              </v:shape>
+            </w:pict>
+          </mc:Fallback>
+        </mc:AlternateContent>
+      </w:r>
+      <w:r>
+        <w:rPr>
+          <w:sz w:val="24"/>
+          <w:szCs w:val="24"/>
+        </w:rPr>
+        <w:t xml:space="preserve">53. Para deixar os campos de forma </w:t>
+      </w:r>
+      <w:r>
+        <w:rPr>
+          <w:sz w:val="24"/>
+          <w:szCs w:val="24"/>
+        </w:rPr>
+        <w:t xml:space="preserve">obrigatória inseríamos o comando do </w:t>
+      </w:r>
+      <w:proofErr w:type="spellStart"/>
+      <w:r>
+        <w:rPr>
+          <w:sz w:val="24"/>
+          <w:szCs w:val="24"/>
+        </w:rPr>
+        <w:t>requerd</w:t>
+      </w:r>
+      <w:proofErr w:type="spellEnd"/>
+      <w:r>
+        <w:rPr>
+          <w:sz w:val="24"/>
+          <w:szCs w:val="24"/>
+        </w:rPr>
+        <w:t xml:space="preserve"> conforme código.</w:t>
+      </w:r>
+      <w:r>
+        <w:rPr>
+          <w:noProof/>
+        </w:rPr>
+        <w:t xml:space="preserve"> </w:t>
+      </w:r>
+      <w:r>
+        <w:rPr>
+          <w:sz w:val="24"/>
+          <w:szCs w:val="24"/>
+        </w:rPr>
+        <w:drawing>
+          <wp:inline distT="0" distB="0" distL="0" distR="0" wp14:anchorId="454867DD" wp14:editId="592D12EE">
+            <wp:extent cx="5400040" cy="1081405"/>
+            <wp:effectExtent l="0" t="0" r="0" b="4445"/>
+            <wp:docPr id="104" name="Imagem 104"/>
+            <wp:cNvGraphicFramePr>
+              <a:graphicFrameLocks xmlns:a="http://schemas.openxmlformats.org/drawingml/2006/main" noChangeAspect="1"/>
+            </wp:cNvGraphicFramePr>
+            <a:graphic xmlns:a="http://schemas.openxmlformats.org/drawingml/2006/main">
+              <a:graphicData uri="http://schemas.openxmlformats.org/drawingml/2006/picture">
+                <pic:pic xmlns:pic="http://schemas.openxmlformats.org/drawingml/2006/picture">
+                  <pic:nvPicPr>
+                    <pic:cNvPr id="1" name=""/>
+                    <pic:cNvPicPr/>
+                  </pic:nvPicPr>
+                  <pic:blipFill>
+                    <a:blip r:embed="rId89"/>
+                    <a:stretch>
+                      <a:fillRect/>
+                    </a:stretch>
+                  </pic:blipFill>
+                  <pic:spPr>
+                    <a:xfrm>
+                      <a:off x="0" y="0"/>
+                      <a:ext cx="5400040" cy="1081405"/>
+                    </a:xfrm>
+                    <a:prstGeom prst="rect">
+                      <a:avLst/>
+                    </a:prstGeom>
+                  </pic:spPr>
+                </pic:pic>
+              </a:graphicData>
+            </a:graphic>
+          </wp:inline>
+        </w:drawing>
+      </w:r>
+    </w:p>
+    <w:p>
+      <w:pPr>
+        <w:tabs>
+          <w:tab w:val="left" w:pos="6375"/>
+        </w:tabs>
+        <w:rPr>
+          <w:sz w:val="24"/>
+          <w:szCs w:val="24"/>
+        </w:rPr>
+      </w:pPr>
+      <w:r>
+        <w:rPr>
+          <w:sz w:val="24"/>
+          <w:szCs w:val="24"/>
+        </w:rPr>
+        <w:t xml:space="preserve">54. Adicionamos o </w:t>
+      </w:r>
+      <w:proofErr w:type="spellStart"/>
+      <w:r>
+        <w:rPr>
+          <w:sz w:val="24"/>
+          <w:szCs w:val="24"/>
+        </w:rPr>
+        <w:t>placeholder</w:t>
+      </w:r>
+      <w:proofErr w:type="spellEnd"/>
+      <w:r>
+        <w:rPr>
+          <w:sz w:val="24"/>
+          <w:szCs w:val="24"/>
+        </w:rPr>
+        <w:t xml:space="preserve"> para dar um exemplo de como deve ser preenchido o campo.</w:t>
+      </w:r>
+      <w:r>
+        <w:rPr>
+          <w:noProof/>
+        </w:rPr>
+        <w:t xml:space="preserve"> </w:t>
+      </w:r>
+      <w:r>
+        <w:rPr>
+          <w:sz w:val="24"/>
+          <w:szCs w:val="24"/>
+        </w:rPr>
+        <w:drawing>
+          <wp:inline distT="0" distB="0" distL="0" distR="0" wp14:anchorId="2816ACCB" wp14:editId="7A1AF5E4">
+            <wp:extent cx="5400040" cy="1108710"/>
+            <wp:effectExtent l="0" t="0" r="0" b="0"/>
+            <wp:docPr id="108" name="Imagem 108"/>
+            <wp:cNvGraphicFramePr>
+              <a:graphicFrameLocks xmlns:a="http://schemas.openxmlformats.org/drawingml/2006/main" noChangeAspect="1"/>
+            </wp:cNvGraphicFramePr>
+            <a:graphic xmlns:a="http://schemas.openxmlformats.org/drawingml/2006/main">
+              <a:graphicData uri="http://schemas.openxmlformats.org/drawingml/2006/picture">
+                <pic:pic xmlns:pic="http://schemas.openxmlformats.org/drawingml/2006/picture">
+                  <pic:nvPicPr>
+                    <pic:cNvPr id="1" name=""/>
+                    <pic:cNvPicPr/>
+                  </pic:nvPicPr>
+                  <pic:blipFill>
+                    <a:blip r:embed="rId90"/>
+                    <a:stretch>
+                      <a:fillRect/>
+                    </a:stretch>
+                  </pic:blipFill>
+                  <pic:spPr>
+                    <a:xfrm>
+                      <a:off x="0" y="0"/>
+                      <a:ext cx="5400040" cy="1108710"/>
+                    </a:xfrm>
+                    <a:prstGeom prst="rect">
+                      <a:avLst/>
+                    </a:prstGeom>
+                  </pic:spPr>
+                </pic:pic>
+              </a:graphicData>
+            </a:graphic>
+          </wp:inline>
+        </w:drawing>
+      </w:r>
+      <w:r>
+        <w:rPr>
+          <w:noProof/>
+        </w:rPr>
+        <w:drawing>
+          <wp:inline distT="0" distB="0" distL="0" distR="0" wp14:anchorId="0BF65890" wp14:editId="78FEF4E1">
+            <wp:extent cx="2171700" cy="1680706"/>
+            <wp:effectExtent l="0" t="0" r="0" b="0"/>
+            <wp:docPr id="109" name="Imagem 109"/>
+            <wp:cNvGraphicFramePr>
+              <a:graphicFrameLocks xmlns:a="http://schemas.openxmlformats.org/drawingml/2006/main" noChangeAspect="1"/>
+            </wp:cNvGraphicFramePr>
+            <a:graphic xmlns:a="http://schemas.openxmlformats.org/drawingml/2006/main">
+              <a:graphicData uri="http://schemas.openxmlformats.org/drawingml/2006/picture">
+                <pic:pic xmlns:pic="http://schemas.openxmlformats.org/drawingml/2006/picture">
+                  <pic:nvPicPr>
+                    <pic:cNvPr id="1" name=""/>
+                    <pic:cNvPicPr/>
+                  </pic:nvPicPr>
+                  <pic:blipFill>
+                    <a:blip r:embed="rId91"/>
+                    <a:stretch>
+                      <a:fillRect/>
+                    </a:stretch>
+                  </pic:blipFill>
+                  <pic:spPr>
+                    <a:xfrm>
+                      <a:off x="0" y="0"/>
+                      <a:ext cx="2191214" cy="1695808"/>
+                    </a:xfrm>
+                    <a:prstGeom prst="rect">
+                      <a:avLst/>
+                    </a:prstGeom>
+                  </pic:spPr>
+                </pic:pic>
+              </a:graphicData>
+            </a:graphic>
+          </wp:inline>
+        </w:drawing>
       </w:r>
       <w:bookmarkStart w:id="0" w:name="_GoBack"/>
       <w:bookmarkEnd w:id="0"/>

</xml_diff>